<commit_message>
fix: redeploy resume.{pdf,html,docx} with corrected Hermes architecture
The Hermes description in the previously-deployed resume claimed
"~50 concurrent conversations with zero human intervention" — both
confabulated. Per the Hermes wiki ADR-0005 verified 2026-06-08, every
first-contact email is a deterministic template (zero AI) and returning
conversations use Bedrock with audit queue, escalation triggers,
operator-takeover flag, and 60-120s human-like send delay.

Source content corrected in martymcenroe/career#980 / PR #981. This
commit republishes the corrected files to the public site.

No-Issue: cross-repo redeploy per martymcenroe/career#980

Co-Authored-By: Claude Opus 4.7 (1M context) <noreply@anthropic.com>
</commit_message>
<xml_diff>
--- a/resume.docx
+++ b/resume.docx
@@ -26,7 +26,7 @@
           <w:rPr>
             <w:rStyle w:val="Hyperlink"/>
           </w:rPr>
-          <w:t xml:space="preserve">recruit@martymcenroe.ai</w:t>
+          <w:t xml:space="preserve">martymcenroe@gmail.com</w:t>
         </w:r>
       </w:hyperlink>
       <w:r>
@@ -34,6 +34,12 @@
       </w:r>
       <w:r>
         <w:t xml:space="preserve">  </w:t>
+      </w:r>
+      <w:r>
+        <w:t xml:space="preserve"> </w:t>
+      </w:r>
+      <w:r>
+        <w:t xml:space="preserve">732-618-3455   </w:t>
       </w:r>
       <w:r>
         <w:t xml:space="preserve"> </w:t>
@@ -191,7 +197,7 @@
           <w:b/>
           <w:bCs/>
         </w:rPr>
-        <w:t xml:space="preserve">Hermes—Autonomous Production Agent</w:t>
+        <w:t xml:space="preserve">Hermes—Autonomous Production Agent for Recruiter Triage</w:t>
       </w:r>
     </w:p>
     <w:p>
@@ -203,7 +209,7 @@
         </w:numPr>
       </w:pPr>
       <w:r>
-        <w:t xml:space="preserve">Production autonomous email agent handling ~50 concurrent conversations with zero human intervention. Finite state machine governs persona and behavior across 9 states and 10 intents.</w:t>
+        <w:t xml:space="preserve">Production autonomous email agent for recruiter triage on Cloudflare Workers + AWS Bedrock. Architectural safety: deterministic first-contact template—zero AI on the highest-stakes message—audit queue gating AI-proposed actions, 10-state conversation state machine with escalation triggers (legal threat, message-count overflow, VIP allowlist), and operator-takeover flag (is_human_managed) for manual control.</w:t>
       </w:r>
     </w:p>
     <w:p>
@@ -215,7 +221,7 @@
         </w:numPr>
       </w:pPr>
       <w:r>
-        <w:t xml:space="preserve">Two-stage LLM pipeline: Haiku for intent classification and entity extraction, Sonnet for generation with full context injection.</w:t>
+        <w:t xml:space="preserve">Two-stage Bedrock pipeline on returning conversations: Haiku for intent classification + entity extraction (10 intents), Sonnet for generation with full context injection. 60-120 second human-like send delay.</w:t>
       </w:r>
     </w:p>
     <w:p>
@@ -227,7 +233,7 @@
         </w:numPr>
       </w:pPr>
       <w:r>
-        <w:t xml:space="preserve">Pipeline of quality gates checks every output: anti-hallucination checks, sensitive-data pattern detection, AI-disclosure prevention, hostile-tone detection. Hybrid-cloud boundary at SQS—Cloudflare Worker ingests, AWS Lambda processes—chosen for autonomous-agent reliability: at-least-once delivery, retry-on-failure, dead-letter quarantine.</w:t>
+        <w:t xml:space="preserve">Pipeline of quality gates on every output: anti-hallucination, sensitive-data pattern detection, AI-disclosure prevention, hostile-tone (27-phrase blocklist). Hybrid-cloud boundary at SQS—Cloudflare Worker ingests + pre-retrieves RAG, AWS Lambda processes—chosen for autonomous-agent reliability: at-least-once delivery, retry-on-failure, dead-letter quarantine. Form-fill gated behind verified GitHub star.</w:t>
       </w:r>
     </w:p>
     <w:p>
@@ -239,7 +245,7 @@
         </w:numPr>
       </w:pPr>
       <w:r>
-        <w:t xml:space="preserve">Stack: Cloudflare Workers, AWS Lambda, SQS, D1, Vectorize, Claude API.</w:t>
+        <w:t xml:space="preserve">Stack: Cloudflare Workers, AWS Lambda, SQS, D1, Vectorize, R2, Bedrock, SES. ~$5-7/month at hundreds of messages.</w:t>
       </w:r>
     </w:p>
     <w:p>

</xml_diff>

<commit_message>
fix: redeploy resume.{pdf,html,docx} with corrected Hermes architecture (#14)
The Hermes description in the previously-deployed resume claimed
"~50 concurrent conversations with zero human intervention" — both
confabulated. Per the Hermes wiki ADR-0005 verified 2026-06-08, every
first-contact email is a deterministic template (zero AI) and returning
conversations use Bedrock with audit queue, escalation triggers,
operator-takeover flag, and 60-120s human-like send delay.

Source content corrected in martymcenroe/career#980 / PR #981. This
commit republishes the corrected files to the public site.

No-Issue: cross-repo redeploy per martymcenroe/career#980

Co-authored-by: Claude Opus 4.7 (1M context) <noreply@anthropic.com>
</commit_message>
<xml_diff>
--- a/resume.docx
+++ b/resume.docx
@@ -26,7 +26,7 @@
           <w:rPr>
             <w:rStyle w:val="Hyperlink"/>
           </w:rPr>
-          <w:t xml:space="preserve">recruit@martymcenroe.ai</w:t>
+          <w:t xml:space="preserve">martymcenroe@gmail.com</w:t>
         </w:r>
       </w:hyperlink>
       <w:r>
@@ -34,6 +34,12 @@
       </w:r>
       <w:r>
         <w:t xml:space="preserve">  </w:t>
+      </w:r>
+      <w:r>
+        <w:t xml:space="preserve"> </w:t>
+      </w:r>
+      <w:r>
+        <w:t xml:space="preserve">732-618-3455   </w:t>
       </w:r>
       <w:r>
         <w:t xml:space="preserve"> </w:t>
@@ -191,7 +197,7 @@
           <w:b/>
           <w:bCs/>
         </w:rPr>
-        <w:t xml:space="preserve">Hermes—Autonomous Production Agent</w:t>
+        <w:t xml:space="preserve">Hermes—Autonomous Production Agent for Recruiter Triage</w:t>
       </w:r>
     </w:p>
     <w:p>
@@ -203,7 +209,7 @@
         </w:numPr>
       </w:pPr>
       <w:r>
-        <w:t xml:space="preserve">Production autonomous email agent handling ~50 concurrent conversations with zero human intervention. Finite state machine governs persona and behavior across 9 states and 10 intents.</w:t>
+        <w:t xml:space="preserve">Production autonomous email agent for recruiter triage on Cloudflare Workers + AWS Bedrock. Architectural safety: deterministic first-contact template—zero AI on the highest-stakes message—audit queue gating AI-proposed actions, 10-state conversation state machine with escalation triggers (legal threat, message-count overflow, VIP allowlist), and operator-takeover flag (is_human_managed) for manual control.</w:t>
       </w:r>
     </w:p>
     <w:p>
@@ -215,7 +221,7 @@
         </w:numPr>
       </w:pPr>
       <w:r>
-        <w:t xml:space="preserve">Two-stage LLM pipeline: Haiku for intent classification and entity extraction, Sonnet for generation with full context injection.</w:t>
+        <w:t xml:space="preserve">Two-stage Bedrock pipeline on returning conversations: Haiku for intent classification + entity extraction (10 intents), Sonnet for generation with full context injection. 60-120 second human-like send delay.</w:t>
       </w:r>
     </w:p>
     <w:p>
@@ -227,7 +233,7 @@
         </w:numPr>
       </w:pPr>
       <w:r>
-        <w:t xml:space="preserve">Pipeline of quality gates checks every output: anti-hallucination checks, sensitive-data pattern detection, AI-disclosure prevention, hostile-tone detection. Hybrid-cloud boundary at SQS—Cloudflare Worker ingests, AWS Lambda processes—chosen for autonomous-agent reliability: at-least-once delivery, retry-on-failure, dead-letter quarantine.</w:t>
+        <w:t xml:space="preserve">Pipeline of quality gates on every output: anti-hallucination, sensitive-data pattern detection, AI-disclosure prevention, hostile-tone (27-phrase blocklist). Hybrid-cloud boundary at SQS—Cloudflare Worker ingests + pre-retrieves RAG, AWS Lambda processes—chosen for autonomous-agent reliability: at-least-once delivery, retry-on-failure, dead-letter quarantine. Form-fill gated behind verified GitHub star.</w:t>
       </w:r>
     </w:p>
     <w:p>
@@ -239,7 +245,7 @@
         </w:numPr>
       </w:pPr>
       <w:r>
-        <w:t xml:space="preserve">Stack: Cloudflare Workers, AWS Lambda, SQS, D1, Vectorize, Claude API.</w:t>
+        <w:t xml:space="preserve">Stack: Cloudflare Workers, AWS Lambda, SQS, D1, Vectorize, R2, Bedrock, SES. ~$5-7/month at hundreds of messages.</w:t>
       </w:r>
     </w:p>
     <w:p>

</xml_diff>

<commit_message>
Publish resume.docx again (Closes #44)
The site publishes the resume in three formats and resume.docx has returned 404
since 2026-07-31, because .assetsignore listed it. That line unpublishes a file
even while git tracks it, so the repo looked correct and the URL did not answer.
A downstream automation fetches all three formats for outbound email and drops
any that fails, which is why thirty-one days of sends carried two attachments
before anyone noticed.

The replacement comment names all three published formats and states that
listing any of them unpublishes it, so the next reader does not have to infer
the rule from one file's absence.

resume.docx also carried the 2026-06-08 build, three revisions behind. It now
holds the current one.

resume.html and resume.pdf keep their exact bytes and do not appear in this
diff.

Closes #44

Co-Authored-By: Claude Opus 5 <noreply@anthropic.com>
</commit_message>
<xml_diff>
--- a/resume.docx
+++ b/resume.docx
@@ -71,13 +71,13 @@
       </w:hyperlink>
     </w:p>
     <w:bookmarkEnd w:id="12"/>
-    <w:bookmarkStart w:id="13" w:name="enterprise-agentic-ai-architect"/>
+    <w:bookmarkStart w:id="13" w:name="X20ff612211c722d62e5087db151f4e672c8092c"/>
     <w:p>
       <w:pPr>
         <w:pStyle w:val="Heading2"/>
       </w:pPr>
       <w:r>
-        <w:t xml:space="preserve">Enterprise Agentic AI Architect</w:t>
+        <w:t xml:space="preserve">Technology Executive—Artificial Intelligence</w:t>
       </w:r>
     </w:p>
     <w:p>
@@ -93,17 +93,17 @@
         <w:pStyle w:val="BodyText"/>
       </w:pPr>
       <w:r>
-        <w:t xml:space="preserve">Architects and governs enterprise agentic AI systems, with three production platforms in service: multi-agent orchestration with cross-vendor adversarial verification, autonomous conversational agents with layered evaluation, and consumer AI with defense-in-depth guardrails. IEEE service concentrated in AI readiness for critical infrastructure: Co-Chair of the IEEE PES Long Range Planning Committee Subcommittee 5 on Emerging Technologies, Digitalization, and AI Readiness; Vice Chair on the published IEEE-SA Industry Connections white paper IC25-004-01 on Grid Readiness for Data Center Deployment (January 2026); Section Chair and Editor on the forthcoming IC25-004-02 on Data Center Design for IT Load Protection. Two U.S. Patents Filed 2026 on AI Agent Safety; 22 issued U.S. patents across a 29-year career at Bell Labs and AT&amp;T including five years as Director of Data Science and Artificial Intelligence.</w:t>
+        <w:t xml:space="preserve">Technology executive who writes industry standards for artificial intelligence and builds production systems. Co-Chairs an emerging technologies subcommittee of the Long Range Planning Committee at the IEEE Power &amp; Energy Society, the world’s largest power engineering body. Directed data science and artificial intelligence at AT&amp;T across a 45-person organization, a $9M annual budget, and $10M in recurring annual savings. Holds 22 issued U.S. patents and filed two in 2026 on AI agent safety, ahead of the standards. Designs and ships production AI products through the Chrome Web Store, Mozilla Add-ons, and the Python Package Index. Licensed Professional Engineer.</w:t>
       </w:r>
     </w:p>
     <w:bookmarkEnd w:id="13"/>
-    <w:bookmarkStart w:id="14" w:name="agent-architecture-and-governance"/>
+    <w:bookmarkStart w:id="15" w:name="ieee-leadership-and-standards"/>
     <w:p>
       <w:pPr>
         <w:pStyle w:val="Heading2"/>
       </w:pPr>
       <w:r>
-        <w:t xml:space="preserve">Agent Architecture and Governance</w:t>
+        <w:t xml:space="preserve">IEEE Leadership and Standards</w:t>
       </w:r>
     </w:p>
     <w:p>
@@ -111,21 +111,17 @@
         <w:pStyle w:val="FirstParagraph"/>
       </w:pPr>
       <w:r>
-        <w:t xml:space="preserve">Three production agentic AI platforms publicly verifiable at</w:t>
-      </w:r>
-      <w:r>
-        <w:t xml:space="preserve"> </w:t>
-      </w:r>
-      <w:hyperlink r:id="rId11">
-        <w:r>
-          <w:rPr>
-            <w:rStyle w:val="Hyperlink"/>
-          </w:rPr>
-          <w:t xml:space="preserve">github.com/martymcenroe</w:t>
-        </w:r>
-      </w:hyperlink>
-      <w:r>
-        <w:t xml:space="preserve">—A+ contributor grade, 10,000+ contributions in the last year, 64 repositories contributed to.</w:t>
+        <w:rPr>
+          <w:b/>
+          <w:bCs/>
+        </w:rPr>
+        <w:t xml:space="preserve">Co-Chair, Emerging Technologies, Digitalization, and AI Readiness—IEEE Power &amp; Energy Society, Long Range Planning Committee</w:t>
+      </w:r>
+      <w:r>
+        <w:t xml:space="preserve"> </w:t>
+      </w:r>
+      <w:r>
+        <w:t xml:space="preserve">| 2026–present</w:t>
       </w:r>
     </w:p>
     <w:p>
@@ -133,351 +129,7 @@
         <w:pStyle w:val="BodyText"/>
       </w:pPr>
       <w:r>
-        <w:rPr>
-          <w:b/>
-          <w:bCs/>
-        </w:rPr>
-        <w:t xml:space="preserve">AssemblyZero—Multi-Agent Orchestration with Cross-Vendor Adversarial Verification</w:t>
-      </w:r>
-    </w:p>
-    <w:p>
-      <w:pPr>
-        <w:pStyle w:val="Compact"/>
-        <w:numPr>
-          <w:ilvl w:val="0"/>
-          <w:numId w:val="1001"/>
-        </w:numPr>
-      </w:pPr>
-      <w:r>
-        <w:t xml:space="preserve">Five-stage LangGraph StateGraph pipeline (Triage→Design→Spec→TDD→PR) coordinating 12+ concurrent Claude and Gemini agents with typed state, conditional routing, retry-with-backoff, and crash recovery via serialized checkpoints.</w:t>
-      </w:r>
-    </w:p>
-    <w:p>
-      <w:pPr>
-        <w:pStyle w:val="Compact"/>
-        <w:numPr>
-          <w:ilvl w:val="0"/>
-          <w:numId w:val="1001"/>
-        </w:numPr>
-      </w:pPr>
-      <w:r>
-        <w:t xml:space="preserve">Cross-vendor adversarial verification—Claude generates, Gemini reviews—catches hallucinations across model families.</w:t>
-      </w:r>
-    </w:p>
-    <w:p>
-      <w:pPr>
-        <w:pStyle w:val="Compact"/>
-        <w:numPr>
-          <w:ilvl w:val="0"/>
-          <w:numId w:val="1001"/>
-        </w:numPr>
-      </w:pPr>
-      <w:r>
-        <w:t xml:space="preserve">Five-layer evaluation framework: execution-based verification (pytest exit codes drive routing), AST structural analysis, cross-model review, stagnation detection, longitudinal learning from accumulated verdicts.</w:t>
-      </w:r>
-    </w:p>
-    <w:p>
-      <w:pPr>
-        <w:pStyle w:val="Compact"/>
-        <w:numPr>
-          <w:ilvl w:val="0"/>
-          <w:numId w:val="1001"/>
-        </w:numPr>
-      </w:pPr>
-      <w:r>
-        <w:t xml:space="preserve">740 issues processed, 88% closure rate, 434 pull requests merged, 5,583 tests. Stack: Python, LangGraph 1.0, DynamoDB, GitHub Actions.</w:t>
-      </w:r>
-    </w:p>
-    <w:p>
-      <w:pPr>
-        <w:pStyle w:val="FirstParagraph"/>
-      </w:pPr>
-      <w:r>
-        <w:rPr>
-          <w:b/>
-          <w:bCs/>
-        </w:rPr>
-        <w:t xml:space="preserve">Hermes—Autonomous Production Agent for Recruiter Triage</w:t>
-      </w:r>
-    </w:p>
-    <w:p>
-      <w:pPr>
-        <w:pStyle w:val="Compact"/>
-        <w:numPr>
-          <w:ilvl w:val="0"/>
-          <w:numId w:val="1002"/>
-        </w:numPr>
-      </w:pPr>
-      <w:r>
-        <w:t xml:space="preserve">Production autonomous email agent for recruiter triage on Cloudflare Workers + AWS Bedrock. Architectural safety: deterministic first-contact template—zero AI on the highest-stakes message—audit queue gating AI-proposed actions, 10-state conversation state machine with escalation triggers (legal threat, message-count overflow, VIP allowlist), and operator-takeover flag (is_human_managed) for manual control.</w:t>
-      </w:r>
-    </w:p>
-    <w:p>
-      <w:pPr>
-        <w:pStyle w:val="Compact"/>
-        <w:numPr>
-          <w:ilvl w:val="0"/>
-          <w:numId w:val="1002"/>
-        </w:numPr>
-      </w:pPr>
-      <w:r>
-        <w:t xml:space="preserve">Two-stage Bedrock pipeline on returning conversations: Haiku for intent classification + entity extraction (10 intents), Sonnet for generation with full context injection. 60-120 second human-like send delay.</w:t>
-      </w:r>
-    </w:p>
-    <w:p>
-      <w:pPr>
-        <w:pStyle w:val="Compact"/>
-        <w:numPr>
-          <w:ilvl w:val="0"/>
-          <w:numId w:val="1002"/>
-        </w:numPr>
-      </w:pPr>
-      <w:r>
-        <w:t xml:space="preserve">Pipeline of quality gates on every output: anti-hallucination, sensitive-data pattern detection, AI-disclosure prevention, hostile-tone (27-phrase blocklist). Hybrid-cloud boundary at SQS—Cloudflare Worker ingests + pre-retrieves RAG, AWS Lambda processes—chosen for autonomous-agent reliability: at-least-once delivery, retry-on-failure, dead-letter quarantine. Form-fill gated behind verified GitHub star.</w:t>
-      </w:r>
-    </w:p>
-    <w:p>
-      <w:pPr>
-        <w:pStyle w:val="Compact"/>
-        <w:numPr>
-          <w:ilvl w:val="0"/>
-          <w:numId w:val="1002"/>
-        </w:numPr>
-      </w:pPr>
-      <w:r>
-        <w:t xml:space="preserve">Stack: Cloudflare Workers, AWS Lambda, SQS, D1, Vectorize, R2, Bedrock, SES. ~$5-7/month at hundreds of messages.</w:t>
-      </w:r>
-    </w:p>
-    <w:p>
-      <w:pPr>
-        <w:pStyle w:val="FirstParagraph"/>
-      </w:pPr>
-      <w:r>
-        <w:rPr>
-          <w:b/>
-          <w:bCs/>
-        </w:rPr>
-        <w:t xml:space="preserve">Aletheia—Consumer AI with Layered Guardrails</w:t>
-      </w:r>
-    </w:p>
-    <w:p>
-      <w:pPr>
-        <w:pStyle w:val="Compact"/>
-        <w:numPr>
-          <w:ilvl w:val="0"/>
-          <w:numId w:val="1003"/>
-        </w:numPr>
-      </w:pPr>
-      <w:r>
-        <w:t xml:space="preserve">Seven-stage handler pipeline for consumer-facing AI product with independent short-circuiting at each stage. Two-layer guardrail system: deterministic denylist followed by semantic LLM classifier with five-category taxonomy returning confidence scores.</w:t>
-      </w:r>
-    </w:p>
-    <w:p>
-      <w:pPr>
-        <w:pStyle w:val="Compact"/>
-        <w:numPr>
-          <w:ilvl w:val="0"/>
-          <w:numId w:val="1003"/>
-        </w:numPr>
-      </w:pPr>
-      <w:r>
-        <w:t xml:space="preserve">Tiered model routing: Nova Micro screens for layered-meaning potential, Claude Opus performs deeper multi-dimensional analysis on user demand.</w:t>
-      </w:r>
-    </w:p>
-    <w:p>
-      <w:pPr>
-        <w:pStyle w:val="Compact"/>
-        <w:numPr>
-          <w:ilvl w:val="0"/>
-          <w:numId w:val="1003"/>
-        </w:numPr>
-      </w:pPr>
-      <w:r>
-        <w:t xml:space="preserve">Privacy-constrained observability—operational metadata only, no content logging.</w:t>
-      </w:r>
-    </w:p>
-    <w:p>
-      <w:pPr>
-        <w:pStyle w:val="Compact"/>
-        <w:numPr>
-          <w:ilvl w:val="0"/>
-          <w:numId w:val="1003"/>
-        </w:numPr>
-      </w:pPr>
-      <w:r>
-        <w:t xml:space="preserve">Stack: AWS Lambda, Bedrock, DynamoDB, CloudFront, Chrome and Firefox extensions.</w:t>
-      </w:r>
-    </w:p>
-    <w:p>
-      <w:pPr>
-        <w:pStyle w:val="FirstParagraph"/>
-      </w:pPr>
-      <w:r>
-        <w:rPr>
-          <w:b/>
-          <w:bCs/>
-        </w:rPr>
-        <w:t xml:space="preserve">Maieutics—Methodology and Tooling for AI-Assisted Technical Authorship</w:t>
-      </w:r>
-    </w:p>
-    <w:p>
-      <w:pPr>
-        <w:pStyle w:val="Compact"/>
-        <w:numPr>
-          <w:ilvl w:val="0"/>
-          <w:numId w:val="1004"/>
-        </w:numPr>
-      </w:pPr>
-      <w:r>
-        <w:t xml:space="preserve">Methodology and tooling for AI-assisted technical authorship at institutional scale. The workflow constrains AI use to assistance and forces substantive human contribution at every step, so the resulting work is defensibly the author's under inspection.</w:t>
-      </w:r>
-    </w:p>
-    <w:p>
-      <w:pPr>
-        <w:pStyle w:val="Compact"/>
-        <w:numPr>
-          <w:ilvl w:val="0"/>
-          <w:numId w:val="1004"/>
-        </w:numPr>
-      </w:pPr>
-      <w:r>
-        <w:t xml:space="preserve">Three core components: per-document audit-trail specification, semantic source-verification that catches paraphrase crossing into copying, and a workflow checklist mapping each step to demonstrable human contribution.</w:t>
-      </w:r>
-    </w:p>
-    <w:p>
-      <w:pPr>
-        <w:pStyle w:val="Compact"/>
-        <w:numPr>
-          <w:ilvl w:val="0"/>
-          <w:numId w:val="1004"/>
-        </w:numPr>
-      </w:pPr>
-      <w:r>
-        <w:t xml:space="preserve">Legal anchor: USPTO Inventorship Guidance for AI-Assisted Inventions and the Pannu v. Iolab Corp. significant-contribution analysis.</w:t>
-      </w:r>
-    </w:p>
-    <w:p>
-      <w:pPr>
-        <w:pStyle w:val="Compact"/>
-        <w:numPr>
-          <w:ilvl w:val="0"/>
-          <w:numId w:val="1004"/>
-        </w:numPr>
-      </w:pPr>
-      <w:r>
-        <w:t xml:space="preserve">Status: private preview, active development. License: PolyForm Noncommercial 1.0.0.</w:t>
-      </w:r>
-    </w:p>
-    <w:p>
-      <w:pPr>
-        <w:pStyle w:val="FirstParagraph"/>
-      </w:pPr>
-      <w:r>
-        <w:rPr>
-          <w:b/>
-          <w:bCs/>
-        </w:rPr>
-        <w:t xml:space="preserve">sentinel-rfc—Agent-Context Permission Bit Architecture</w:t>
-      </w:r>
-    </w:p>
-    <w:p>
-      <w:pPr>
-        <w:pStyle w:val="Compact"/>
-        <w:numPr>
-          <w:ilvl w:val="0"/>
-          <w:numId w:val="1005"/>
-        </w:numPr>
-      </w:pPr>
-      <w:r>
-        <w:t xml:space="preserve">Active applied research program proposing agent-context permission bits as an architectural alternative to the "agent inherits user permissions" model that creates excessive blast radius for autonomous agents.</w:t>
-      </w:r>
-    </w:p>
-    <w:p>
-      <w:pPr>
-        <w:pStyle w:val="Compact"/>
-        <w:numPr>
-          <w:ilvl w:val="0"/>
-          <w:numId w:val="1005"/>
-        </w:numPr>
-      </w:pPr>
-      <w:r>
-        <w:t xml:space="preserve">Scope includes manifest specification, capability authorization design, and prototype work targeting filesystem-level enforcement.</w:t>
-      </w:r>
-    </w:p>
-    <w:p>
-      <w:pPr>
-        <w:pStyle w:val="FirstParagraph"/>
-      </w:pPr>
-      <w:r>
-        <w:rPr>
-          <w:b/>
-          <w:bCs/>
-        </w:rPr>
-        <w:t xml:space="preserve">AI &amp; Data Science Architecture Review Board (AT&amp;T)—Enterprise Governance Precedent</w:t>
-      </w:r>
-    </w:p>
-    <w:p>
-      <w:pPr>
-        <w:pStyle w:val="Compact"/>
-        <w:numPr>
-          <w:ilvl w:val="0"/>
-          <w:numId w:val="1006"/>
-        </w:numPr>
-      </w:pPr>
-      <w:r>
-        <w:t xml:space="preserve">Founding chair of the enterprise AI and Data Science Architecture Review Board, establishing governance gates for AI systems across business units of a Fortune 10 enterprise.</w:t>
-      </w:r>
-    </w:p>
-    <w:p>
-      <w:pPr>
-        <w:pStyle w:val="Compact"/>
-        <w:numPr>
-          <w:ilvl w:val="0"/>
-          <w:numId w:val="1006"/>
-        </w:numPr>
-      </w:pPr>
-      <w:r>
-        <w:t xml:space="preserve">Evaluated frameworks, vendors, and architectures for security, interoperability, licensing, and cost. Drove standardization of Python and R as enterprise-approved languages.</w:t>
-      </w:r>
-    </w:p>
-    <w:p>
-      <w:pPr>
-        <w:pStyle w:val="Compact"/>
-        <w:numPr>
-          <w:ilvl w:val="0"/>
-          <w:numId w:val="1006"/>
-        </w:numPr>
-      </w:pPr>
-      <w:r>
-        <w:t xml:space="preserve">Deployed and administered Stack Overflow Enterprise to 31,000 users, navigating Technical Architecture Board approvals, security reviews, and privacy compliance.</w:t>
-      </w:r>
-    </w:p>
-    <w:bookmarkEnd w:id="14"/>
-    <w:bookmarkStart w:id="16" w:name="ieee-leadership-and-standards"/>
-    <w:p>
-      <w:pPr>
-        <w:pStyle w:val="Heading2"/>
-      </w:pPr>
-      <w:r>
-        <w:t xml:space="preserve">IEEE Leadership and Standards</w:t>
-      </w:r>
-    </w:p>
-    <w:p>
-      <w:pPr>
-        <w:pStyle w:val="FirstParagraph"/>
-      </w:pPr>
-      <w:r>
-        <w:rPr>
-          <w:b/>
-          <w:bCs/>
-        </w:rPr>
-        <w:t xml:space="preserve">Co-Chair, IEEE PES Long Range Planning Committee, Subcommittee 5</w:t>
-      </w:r>
-      <w:r>
-        <w:t xml:space="preserve"> </w:t>
-      </w:r>
-      <w:r>
-        <w:t xml:space="preserve">| 2026–present</w:t>
+        <w:t xml:space="preserve">Forecast the technologies reaching the power system over the next five to fifteen years, and advise the Society on where to act. Convene fourteen voting members drawn from industry, universities, and government across eight countries. Delivered the subcommittee’s Vision Document, its agenda for AI and digitalization in the power system: members reviewed candidate priorities and voted independently on each, adopting 234. Twelve areas now under investigation, among them trustworthy and certified AI, cyber-physical security, quantum computation, and autonomous closed-loop grid operation.</w:t>
       </w:r>
     </w:p>
     <w:p>
@@ -485,7 +137,17 @@
         <w:pStyle w:val="BodyText"/>
       </w:pPr>
       <w:r>
-        <w:t xml:space="preserve">Emerging Technologies, Digitalization, and AI Readiness. Reports to PES Governing Board via LRPC Chair (PES President-Elect). Vision Document due July 2026 PES General Meeting.</w:t>
+        <w:rPr>
+          <w:b/>
+          <w:bCs/>
+        </w:rPr>
+        <w:t xml:space="preserve">Officer and Lead Author, Data Centers and the Grid—IEEE Standards Association</w:t>
+      </w:r>
+      <w:r>
+        <w:t xml:space="preserve"> </w:t>
+      </w:r>
+      <w:r>
+        <w:t xml:space="preserve">| 2025–present</w:t>
       </w:r>
     </w:p>
     <w:p>
@@ -493,27 +155,9 @@
         <w:pStyle w:val="BodyText"/>
       </w:pPr>
       <w:r>
-        <w:rPr>
-          <w:b/>
-          <w:bCs/>
-        </w:rPr>
-        <w:t xml:space="preserve">Vice Chair, IC25-004-01—Industry Standards for Grid Readiness for Data Center Deployment</w:t>
-      </w:r>
-      <w:r>
-        <w:t xml:space="preserve"> </w:t>
-      </w:r>
-      <w:r>
-        <w:t xml:space="preserve">| 2025–2026</w:t>
-      </w:r>
-    </w:p>
-    <w:p>
-      <w:pPr>
-        <w:pStyle w:val="BodyText"/>
-      </w:pPr>
-      <w:r>
-        <w:t xml:space="preserve">IEEE-SA Industry Connections, Data Centers: Standards Needs Analysis and Recommendations. Published January 29, 2026 (</w:t>
-      </w:r>
-      <w:hyperlink r:id="rId15">
+        <w:t xml:space="preserve">Activity Secretary of the IEEE Standards Association program on data center growth, the sector’s most urgent capacity problem. Vice Chair of the first white paper, published January 2026 (</w:t>
+      </w:r>
+      <w:hyperlink r:id="rId14">
         <w:r>
           <w:rPr>
             <w:rStyle w:val="Hyperlink"/>
@@ -522,7 +166,7 @@
         </w:r>
       </w:hyperlink>
       <w:r>
-        <w:t xml:space="preserve">). Recommendations triggered an IEEE SETCom study group (approved February 26, 2026) developing Project Authorization Requests for five new IEEE standards on data center interconnection, performance, modeling, co-located generation, and flexibility.</w:t>
+        <w:t xml:space="preserve">). It triggered an IEEE study group that approved five new standards projects. One of four lead authors on the second paper, now in editorial review.</w:t>
       </w:r>
     </w:p>
     <w:p>
@@ -534,13 +178,13 @@
           <w:b/>
           <w:bCs/>
         </w:rPr>
-        <w:t xml:space="preserve">Section Chair and Editor, IC25-004-02 Section 5—Data Center Design for IT Load Protection</w:t>
-      </w:r>
-      <w:r>
-        <w:t xml:space="preserve"> </w:t>
-      </w:r>
-      <w:r>
-        <w:t xml:space="preserve">| 2025–2026</w:t>
+        <w:t xml:space="preserve">Standards Author and Working Group Member—IEEE Power &amp; Energy Society</w:t>
+      </w:r>
+      <w:r>
+        <w:t xml:space="preserve"> </w:t>
+      </w:r>
+      <w:r>
+        <w:t xml:space="preserve">| 2025–present</w:t>
       </w:r>
     </w:p>
     <w:p>
@@ -548,7 +192,487 @@
         <w:pStyle w:val="BodyText"/>
       </w:pPr>
       <w:r>
-        <w:t xml:space="preserve">Section 5: Consumption Patterns and Disturbance Response. IEEE-SA Industry Connections; publishing 2026.</w:t>
+        <w:t xml:space="preserve">Serve on four working groups across the security and data agenda. Authored the use-case section of the report on software bills of materials in the energy sector, grounded in federal guidance from the Cybersecurity and Infrastructure Security Agency, the National Security Agency, and NERC. Authored a section of the joint task force report naming which new communications standards should exist. Founding member of IEEE P4200, which sets the interconnection, performance, and interoperability requirements for attaching data centers to transmission and distribution systems. Contributing author on the large-load integration report.</w:t>
+      </w:r>
+    </w:p>
+    <w:bookmarkEnd w:id="15"/>
+    <w:bookmarkStart w:id="17" w:name="thrivetech.aiapplied-ai-portfolio"/>
+    <w:p>
+      <w:pPr>
+        <w:pStyle w:val="Heading2"/>
+      </w:pPr>
+      <w:r>
+        <w:t xml:space="preserve">ThriveTech.ai—Applied AI Portfolio</w:t>
+      </w:r>
+    </w:p>
+    <w:p>
+      <w:pPr>
+        <w:pStyle w:val="FirstParagraph"/>
+      </w:pPr>
+      <w:r>
+        <w:rPr>
+          <w:b/>
+          <w:bCs/>
+        </w:rPr>
+        <w:t xml:space="preserve">Multi-Agent Engineering Systems—AssemblyZero</w:t>
+      </w:r>
+    </w:p>
+    <w:p>
+      <w:pPr>
+        <w:pStyle w:val="Compact"/>
+        <w:numPr>
+          <w:ilvl w:val="0"/>
+          <w:numId w:val="1001"/>
+        </w:numPr>
+      </w:pPr>
+      <w:r>
+        <w:t xml:space="preserve">Built an engineering organization staffed by AI agents. AssemblyZero builds every product in this portfolio, and built and improves itself. Five stages run from triage through design, specification, test-driven development, and pull request, coordinating twelve or more concurrent agents with typed state, conditional routing, and crash recovery.</w:t>
+      </w:r>
+    </w:p>
+    <w:p>
+      <w:pPr>
+        <w:pStyle w:val="Compact"/>
+        <w:numPr>
+          <w:ilvl w:val="0"/>
+          <w:numId w:val="1001"/>
+        </w:numPr>
+      </w:pPr>
+      <w:r>
+        <w:t xml:space="preserve">Designed cross-vendor adversarial verification, the core idea: one vendor’s model writes the code, a different vendor’s model reviews it. Errors that survive one model rarely survive two trained by separate companies.</w:t>
+      </w:r>
+    </w:p>
+    <w:p>
+      <w:pPr>
+        <w:pStyle w:val="Compact"/>
+        <w:numPr>
+          <w:ilvl w:val="0"/>
+          <w:numId w:val="1001"/>
+        </w:numPr>
+      </w:pPr>
+      <w:r>
+        <w:t xml:space="preserve">Built five evaluation layers that every change must clear: test execution, structural analysis of the code, cross-model review, stagnation detection, and learning from accumulated verdicts.</w:t>
+      </w:r>
+    </w:p>
+    <w:p>
+      <w:pPr>
+        <w:pStyle w:val="Compact"/>
+        <w:numPr>
+          <w:ilvl w:val="0"/>
+          <w:numId w:val="1001"/>
+        </w:numPr>
+      </w:pPr>
+      <w:r>
+        <w:t xml:space="preserve">Processed 1,578 issues at a 91% closure rate, merged 1,031 pull requests, and grew the test suite to 9,982. Python, LangGraph, DynamoDB, GitHub Actions.</w:t>
+      </w:r>
+    </w:p>
+    <w:p>
+      <w:pPr>
+        <w:pStyle w:val="FirstParagraph"/>
+      </w:pPr>
+      <w:r>
+        <w:rPr>
+          <w:b/>
+          <w:bCs/>
+        </w:rPr>
+        <w:t xml:space="preserve">Adaptive Learning Systems—Chiron (chiron.thrivetech.ai)</w:t>
+      </w:r>
+    </w:p>
+    <w:p>
+      <w:pPr>
+        <w:pStyle w:val="Compact"/>
+        <w:numPr>
+          <w:ilvl w:val="0"/>
+          <w:numId w:val="1002"/>
+        </w:numPr>
+      </w:pPr>
+      <w:r>
+        <w:t xml:space="preserve">Built a live learning platform running eleven subject domains, from AI governance and patent law to real analysis, music theory, and amateur radio licensure.</w:t>
+      </w:r>
+    </w:p>
+    <w:p>
+      <w:pPr>
+        <w:pStyle w:val="Compact"/>
+        <w:numPr>
+          <w:ilvl w:val="0"/>
+          <w:numId w:val="1002"/>
+        </w:numPr>
+      </w:pPr>
+      <w:r>
+        <w:t xml:space="preserve">Designed a question generator that works from cited source material, classifies each item against Bloom’s Revised Taxonomy and Webb’s Depth of Knowledge, and tags every wrong answer with the specific misconception it represents under the SOLO taxonomy.</w:t>
+      </w:r>
+    </w:p>
+    <w:p>
+      <w:pPr>
+        <w:pStyle w:val="Compact"/>
+        <w:numPr>
+          <w:ilvl w:val="0"/>
+          <w:numId w:val="1002"/>
+        </w:numPr>
+      </w:pPr>
+      <w:r>
+        <w:t xml:space="preserve">Designed a knowledge model spanning all eleven domains instead of siloing them: a shared ontology, a prerequisite graph, and per-learner mastery state.</w:t>
+      </w:r>
+    </w:p>
+    <w:p>
+      <w:pPr>
+        <w:pStyle w:val="Compact"/>
+        <w:numPr>
+          <w:ilvl w:val="0"/>
+          <w:numId w:val="1002"/>
+        </w:numPr>
+      </w:pPr>
+      <w:r>
+        <w:t xml:space="preserve">Ensured no learner meets a question resting on a concept they have not established. Introduces and teaches new concepts at the learner’s knowledge frontier. Ranked selection by unseen material, then by decayed per-concept mastery.</w:t>
+      </w:r>
+    </w:p>
+    <w:p>
+      <w:pPr>
+        <w:pStyle w:val="Compact"/>
+        <w:numPr>
+          <w:ilvl w:val="0"/>
+          <w:numId w:val="1002"/>
+        </w:numPr>
+      </w:pPr>
+      <w:r>
+        <w:t xml:space="preserve">Wrote the research behind it, a cross-domain study of which cognitive frameworks survive automated question generation, including where Bloom’s levels alone let a model produce an item that only looks analytical.</w:t>
+      </w:r>
+    </w:p>
+    <w:p>
+      <w:pPr>
+        <w:pStyle w:val="FirstParagraph"/>
+      </w:pPr>
+      <w:r>
+        <w:rPr>
+          <w:b/>
+          <w:bCs/>
+        </w:rPr>
+        <w:t xml:space="preserve">Language and Culture—thetrail.online</w:t>
+      </w:r>
+    </w:p>
+    <w:p>
+      <w:pPr>
+        <w:pStyle w:val="Compact"/>
+        <w:numPr>
+          <w:ilvl w:val="0"/>
+          <w:numId w:val="1003"/>
+        </w:numPr>
+      </w:pPr>
+      <w:r>
+        <w:t xml:space="preserve">Built a subscription product that teaches language and culture along real long-distance walks, opening with the Camino Francés in Spanish. A walker moves stage by stage; encounters recur; the vocabulary is the vocabulary of hospitality.</w:t>
+      </w:r>
+    </w:p>
+    <w:p>
+      <w:pPr>
+        <w:pStyle w:val="Compact"/>
+        <w:numPr>
+          <w:ilvl w:val="0"/>
+          <w:numId w:val="1003"/>
+        </w:numPr>
+      </w:pPr>
+      <w:r>
+        <w:t xml:space="preserve">Designed the motivation to come from the walker rather than from streaks and mascots. People already dream of a specific walk, and every walk carries a language.</w:t>
+      </w:r>
+    </w:p>
+    <w:p>
+      <w:pPr>
+        <w:pStyle w:val="Compact"/>
+        <w:numPr>
+          <w:ilvl w:val="0"/>
+          <w:numId w:val="1003"/>
+        </w:numPr>
+      </w:pPr>
+      <w:r>
+        <w:t xml:space="preserve">Structured each stage across four levels, gated on proficiency, with click-to-hear audio on every word.</w:t>
+      </w:r>
+    </w:p>
+    <w:p>
+      <w:pPr>
+        <w:pStyle w:val="Compact"/>
+        <w:numPr>
+          <w:ilvl w:val="0"/>
+          <w:numId w:val="1003"/>
+        </w:numPr>
+      </w:pPr>
+      <w:r>
+        <w:t xml:space="preserve">Built a human curation gate: no image, recording, or encounter reaches a learner without review.</w:t>
+      </w:r>
+    </w:p>
+    <w:p>
+      <w:pPr>
+        <w:pStyle w:val="FirstParagraph"/>
+      </w:pPr>
+      <w:r>
+        <w:rPr>
+          <w:b/>
+          <w:bCs/>
+        </w:rPr>
+        <w:t xml:space="preserve">AI for Critical Infrastructure—Palaestra and Exedra (palaestra.thrivetech.ai)</w:t>
+      </w:r>
+    </w:p>
+    <w:p>
+      <w:pPr>
+        <w:pStyle w:val="Compact"/>
+        <w:numPr>
+          <w:ilvl w:val="0"/>
+          <w:numId w:val="1004"/>
+        </w:numPr>
+      </w:pPr>
+      <w:r>
+        <w:t xml:space="preserve">Built Palaestra to measure how best large data centers can flex their demand under grid stress, the open question in the IEEE data center work above.</w:t>
+      </w:r>
+    </w:p>
+    <w:p>
+      <w:pPr>
+        <w:pStyle w:val="Compact"/>
+        <w:numPr>
+          <w:ilvl w:val="0"/>
+          <w:numId w:val="1004"/>
+        </w:numPr>
+      </w:pPr>
+      <w:r>
+        <w:t xml:space="preserve">Designed a competition in which a player runs a data center at the grid interface for a simulated day, scored against a certified optimal line. Human or AI agent; both speak the same interface. Built five scenarios on public reliability testbeds.</w:t>
+      </w:r>
+    </w:p>
+    <w:p>
+      <w:pPr>
+        <w:pStyle w:val="Compact"/>
+        <w:numPr>
+          <w:ilvl w:val="0"/>
+          <w:numId w:val="1004"/>
+        </w:numPr>
+      </w:pPr>
+      <w:r>
+        <w:t xml:space="preserve">Published the scenario format, the competitor interface, and the complete engine rules as Exedra (</w:t>
+      </w:r>
+      <w:hyperlink r:id="rId16">
+        <w:r>
+          <w:rPr>
+            <w:rStyle w:val="Hyperlink"/>
+          </w:rPr>
+          <w:t xml:space="preserve">github.com/martymcenroe/Exedra</w:t>
+        </w:r>
+      </w:hyperlink>
+      <w:r>
+        <w:t xml:space="preserve">), so any group can build a scenario from its own region’s public grid records. Wrote a multi-lesson curriculum.</w:t>
+      </w:r>
+    </w:p>
+    <w:p>
+      <w:pPr>
+        <w:pStyle w:val="FirstParagraph"/>
+      </w:pPr>
+      <w:r>
+        <w:rPr>
+          <w:b/>
+          <w:bCs/>
+        </w:rPr>
+        <w:t xml:space="preserve">Consumer and Developer Products—Shipped Through Three Public Registries</w:t>
+      </w:r>
+    </w:p>
+    <w:p>
+      <w:pPr>
+        <w:pStyle w:val="Compact"/>
+        <w:numPr>
+          <w:ilvl w:val="0"/>
+          <w:numId w:val="1005"/>
+        </w:numPr>
+      </w:pPr>
+      <w:r>
+        <w:t xml:space="preserve">Shipped</w:t>
+      </w:r>
+      <w:r>
+        <w:t xml:space="preserve"> </w:t>
+      </w:r>
+      <w:r>
+        <w:rPr>
+          <w:b/>
+          <w:bCs/>
+        </w:rPr>
+        <w:t xml:space="preserve">Aletheia</w:t>
+      </w:r>
+      <w:r>
+        <w:t xml:space="preserve"> </w:t>
+      </w:r>
+      <w:r>
+        <w:t xml:space="preserve">to both the Chrome Web Store and Mozilla Add-ons: select any text on any page and get the etymology and historical context concealed inside it. Named for Heidegger’s term for unconcealment.</w:t>
+      </w:r>
+    </w:p>
+    <w:p>
+      <w:pPr>
+        <w:pStyle w:val="Compact"/>
+        <w:numPr>
+          <w:ilvl w:val="0"/>
+          <w:numId w:val="1005"/>
+        </w:numPr>
+      </w:pPr>
+      <w:r>
+        <w:t xml:space="preserve">Designed a model ladder the reader climbs on request. A cheap model makes the first pass. Each request for more depth moves the work up a tier, and the analysis unconceals at ever-greater depths of meaning and poetry.</w:t>
+      </w:r>
+    </w:p>
+    <w:p>
+      <w:pPr>
+        <w:pStyle w:val="Compact"/>
+        <w:numPr>
+          <w:ilvl w:val="0"/>
+          <w:numId w:val="1005"/>
+        </w:numPr>
+      </w:pPr>
+      <w:r>
+        <w:t xml:space="preserve">Screened every request through a defense funnel before any analysis runs: selection check, hashed denylist, then a semantic classifier. Tested against eight attack classes. Limited logging to operational metadata, never content.</w:t>
+      </w:r>
+    </w:p>
+    <w:p>
+      <w:pPr>
+        <w:pStyle w:val="Compact"/>
+        <w:numPr>
+          <w:ilvl w:val="0"/>
+          <w:numId w:val="1005"/>
+        </w:numPr>
+      </w:pPr>
+      <w:r>
+        <w:t xml:space="preserve">Built</w:t>
+      </w:r>
+      <w:r>
+        <w:t xml:space="preserve"> </w:t>
+      </w:r>
+      <w:r>
+        <w:rPr>
+          <w:b/>
+          <w:bCs/>
+        </w:rPr>
+        <w:t xml:space="preserve">Clio</w:t>
+      </w:r>
+      <w:r>
+        <w:t xml:space="preserve">, a Chrome Web Store extension that extracts conversations with language models into structured data.</w:t>
+      </w:r>
+    </w:p>
+    <w:p>
+      <w:pPr>
+        <w:pStyle w:val="Compact"/>
+        <w:numPr>
+          <w:ilvl w:val="0"/>
+          <w:numId w:val="1005"/>
+        </w:numPr>
+      </w:pPr>
+      <w:r>
+        <w:t xml:space="preserve">Published</w:t>
+      </w:r>
+      <w:r>
+        <w:t xml:space="preserve"> </w:t>
+      </w:r>
+      <w:r>
+        <w:rPr>
+          <w:b/>
+          <w:bCs/>
+        </w:rPr>
+        <w:t xml:space="preserve">Silphe</w:t>
+      </w:r>
+      <w:r>
+        <w:t xml:space="preserve"> </w:t>
+      </w:r>
+      <w:r>
+        <w:t xml:space="preserve">to the Python Package Index, a behavioral biometrics library that quantifies a visuomotor signature from pointer dynamics: acquisition under Fitts’s law, hold tremor, and tracking lag. Kept analysis on the device and shipped with no third-party runtime dependencies.</w:t>
+      </w:r>
+    </w:p>
+    <w:p>
+      <w:pPr>
+        <w:pStyle w:val="FirstParagraph"/>
+      </w:pPr>
+      <w:r>
+        <w:rPr>
+          <w:b/>
+          <w:bCs/>
+        </w:rPr>
+        <w:t xml:space="preserve">Agent Safety Research</w:t>
+      </w:r>
+    </w:p>
+    <w:p>
+      <w:pPr>
+        <w:pStyle w:val="Compact"/>
+        <w:numPr>
+          <w:ilvl w:val="0"/>
+          <w:numId w:val="1006"/>
+        </w:numPr>
+      </w:pPr>
+      <w:r>
+        <w:t xml:space="preserve">Filed two U.S. patents in 2026 on AI agent safety, as independent inventor and applicant.</w:t>
+      </w:r>
+    </w:p>
+    <w:p>
+      <w:pPr>
+        <w:pStyle w:val="Compact"/>
+        <w:numPr>
+          <w:ilvl w:val="0"/>
+          <w:numId w:val="1006"/>
+        </w:numPr>
+      </w:pPr>
+      <w:r>
+        <w:t xml:space="preserve">Mapped AI agent failure modes onto MITRE ATT&amp;CK insider-threat techniques. An agent pushed to finish a task behaves like an insider. Built a 42-probe audit tool across eight tactics and hardened a 50-repository fleet against what it found.</w:t>
+      </w:r>
+    </w:p>
+    <w:p>
+      <w:pPr>
+        <w:pStyle w:val="Compact"/>
+        <w:numPr>
+          <w:ilvl w:val="0"/>
+          <w:numId w:val="1006"/>
+        </w:numPr>
+      </w:pPr>
+      <w:r>
+        <w:t xml:space="preserve">Designed</w:t>
+      </w:r>
+      <w:r>
+        <w:t xml:space="preserve"> </w:t>
+      </w:r>
+      <w:r>
+        <w:rPr>
+          <w:b/>
+          <w:bCs/>
+        </w:rPr>
+        <w:t xml:space="preserve">sentinel-rfc</w:t>
+      </w:r>
+      <w:r>
+        <w:t xml:space="preserve">, an architecture giving agents their own permissions rather than inheriting the user’s. Built</w:t>
+      </w:r>
+      <w:r>
+        <w:t xml:space="preserve"> </w:t>
+      </w:r>
+      <w:r>
+        <w:rPr>
+          <w:b/>
+          <w:bCs/>
+        </w:rPr>
+        <w:t xml:space="preserve">Maieutics</w:t>
+      </w:r>
+      <w:r>
+        <w:t xml:space="preserve">, a method for proving human authorship of AI-assisted technical work, anchored in USPTO inventorship guidance.</w:t>
+      </w:r>
+    </w:p>
+    <w:bookmarkEnd w:id="17"/>
+    <w:bookmarkStart w:id="18" w:name="professional-experience"/>
+    <w:p>
+      <w:pPr>
+        <w:pStyle w:val="Heading2"/>
+      </w:pPr>
+      <w:r>
+        <w:t xml:space="preserve">Professional Experience</w:t>
+      </w:r>
+    </w:p>
+    <w:p>
+      <w:pPr>
+        <w:pStyle w:val="FirstParagraph"/>
+      </w:pPr>
+      <w:r>
+        <w:rPr>
+          <w:b/>
+          <w:bCs/>
+        </w:rPr>
+        <w:t xml:space="preserve">THRIVETECH.AI</w:t>
+      </w:r>
+      <w:r>
+        <w:t xml:space="preserve"> </w:t>
+      </w:r>
+      <w:r>
+        <w:t xml:space="preserve">– Plano, TX | June 2022–present</w:t>
       </w:r>
     </w:p>
     <w:p>
@@ -560,13 +684,7 @@
           <w:b/>
           <w:bCs/>
         </w:rPr>
-        <w:t xml:space="preserve">Section Author, IEEE PES PSCCC S17—Use of Software Bill of Materials (SBOM) in the Energy Sector</w:t>
-      </w:r>
-      <w:r>
-        <w:t xml:space="preserve"> </w:t>
-      </w:r>
-      <w:r>
-        <w:t xml:space="preserve">| 2025–present</w:t>
+        <w:t xml:space="preserve">Founder &amp; President</w:t>
       </w:r>
     </w:p>
     <w:p>
@@ -574,17 +692,399 @@
         <w:pStyle w:val="BodyText"/>
       </w:pPr>
       <w:r>
-        <w:t xml:space="preserve">Section: Use Cases in the EPS Industry. Six use-case analyses: procurement vs. maintenance vulnerability assessment, OSS licensing, country-of-origin and embargo risk, system-level SBOM, legacy devices, and SBOM scope beyond IEDs/RTUs. Citations span NIST SP 800-161 r1, NERC CIP-010/013, CISA/NSA/NTIA, NDAA §889, BIS Entity List, and peer-reviewed substation BoM literature.</w:t>
-      </w:r>
-    </w:p>
-    <w:bookmarkEnd w:id="16"/>
-    <w:bookmarkStart w:id="17" w:name="professional-experience"/>
+        <w:t xml:space="preserve">Independent AI architecture practice and consulting vehicle; holds the invention portfolio. Products and research are listed above under Applied AI Portfolio.</w:t>
+      </w:r>
+    </w:p>
+    <w:p>
+      <w:pPr>
+        <w:pStyle w:val="BodyText"/>
+      </w:pPr>
+      <w:r>
+        <w:rPr>
+          <w:b/>
+          <w:bCs/>
+        </w:rPr>
+        <w:t xml:space="preserve">TEXAS DEPARTMENT OF TRANSPORTATION</w:t>
+      </w:r>
+      <w:r>
+        <w:t xml:space="preserve"> </w:t>
+      </w:r>
+      <w:r>
+        <w:t xml:space="preserve">– Austin, TX | September 2023–April 2024</w:t>
+      </w:r>
+    </w:p>
+    <w:p>
+      <w:pPr>
+        <w:pStyle w:val="BodyText"/>
+      </w:pPr>
+      <w:r>
+        <w:rPr>
+          <w:b/>
+          <w:bCs/>
+        </w:rPr>
+        <w:t xml:space="preserve">AI Strategic Consultant</w:t>
+      </w:r>
+    </w:p>
+    <w:p>
+      <w:pPr>
+        <w:pStyle w:val="Compact"/>
+        <w:numPr>
+          <w:ilvl w:val="0"/>
+          <w:numId w:val="1007"/>
+        </w:numPr>
+      </w:pPr>
+      <w:r>
+        <w:t xml:space="preserve">Authored 76-page AI strategic plan encompassing 32 epics, 213 use cases, governance controls, risk assessments, and AI ethics framework for state-wide transportation agency.</w:t>
+      </w:r>
+    </w:p>
+    <w:p>
+      <w:pPr>
+        <w:pStyle w:val="Compact"/>
+        <w:numPr>
+          <w:ilvl w:val="0"/>
+          <w:numId w:val="1007"/>
+        </w:numPr>
+      </w:pPr>
+      <w:r>
+        <w:t xml:space="preserve">Conducted stakeholder interviews across every division and district; applied LDA topic modeling to surface themes and identify high-priority AI applications meeting federal and state regulatory requirements.</w:t>
+      </w:r>
+    </w:p>
+    <w:p>
+      <w:pPr>
+        <w:pStyle w:val="Compact"/>
+        <w:numPr>
+          <w:ilvl w:val="0"/>
+          <w:numId w:val="1007"/>
+        </w:numPr>
+      </w:pPr>
+      <w:r>
+        <w:t xml:space="preserve">Translated technical AI capabilities into business-value propositions for non-technical executives; established phased implementation roadmaps balancing feasibility, compliance, and organizational change.</w:t>
+      </w:r>
+    </w:p>
+    <w:p>
+      <w:pPr>
+        <w:pStyle w:val="FirstParagraph"/>
+      </w:pPr>
+      <w:r>
+        <w:rPr>
+          <w:b/>
+          <w:bCs/>
+        </w:rPr>
+        <w:t xml:space="preserve">AFINITI</w:t>
+      </w:r>
+      <w:r>
+        <w:t xml:space="preserve"> </w:t>
+      </w:r>
+      <w:r>
+        <w:t xml:space="preserve">– Washington, DC | March 2021–June 2022</w:t>
+      </w:r>
+    </w:p>
+    <w:p>
+      <w:pPr>
+        <w:pStyle w:val="BodyText"/>
+      </w:pPr>
+      <w:r>
+        <w:rPr>
+          <w:b/>
+          <w:bCs/>
+        </w:rPr>
+        <w:t xml:space="preserve">Vice President, Product</w:t>
+      </w:r>
+    </w:p>
+    <w:p>
+      <w:pPr>
+        <w:pStyle w:val="BodyText"/>
+      </w:pPr>
+      <w:r>
+        <w:t xml:space="preserve">Product and security leadership for AI-powered customer-agent pairing platform optimizing enterprise contact center operations through behavioral analytics and machine learning.</w:t>
+      </w:r>
+    </w:p>
+    <w:p>
+      <w:pPr>
+        <w:pStyle w:val="Compact"/>
+        <w:numPr>
+          <w:ilvl w:val="0"/>
+          <w:numId w:val="1008"/>
+        </w:numPr>
+      </w:pPr>
+      <w:r>
+        <w:t xml:space="preserve">Led security architecture initiatives on a ~1M-line, 10-year-old C/C++ codebase: SonarQube vulnerability remediation, penetration test remediation, architecture reviews, API security hardening.</w:t>
+      </w:r>
+    </w:p>
+    <w:p>
+      <w:pPr>
+        <w:pStyle w:val="Compact"/>
+        <w:numPr>
+          <w:ilvl w:val="0"/>
+          <w:numId w:val="1008"/>
+        </w:numPr>
+      </w:pPr>
+      <w:r>
+        <w:t xml:space="preserve">Defined cross-functional product development processes spanning engineering, AI research, MLOps, and go-to-market. Hands-on DevOps across GCP and Azure (Docker, Jira, CI/CD).</w:t>
+      </w:r>
+    </w:p>
+    <w:p>
+      <w:pPr>
+        <w:pStyle w:val="Compact"/>
+        <w:numPr>
+          <w:ilvl w:val="0"/>
+          <w:numId w:val="1008"/>
+        </w:numPr>
+      </w:pPr>
+      <w:r>
+        <w:t xml:space="preserve">Set product strategy and prioritization across quarterly and sprint planning cycles, balancing ML algorithm investment against operational improvements and production issues.</w:t>
+      </w:r>
+    </w:p>
+    <w:p>
+      <w:pPr>
+        <w:pStyle w:val="FirstParagraph"/>
+      </w:pPr>
+      <w:r>
+        <w:rPr>
+          <w:b/>
+          <w:bCs/>
+        </w:rPr>
+        <w:t xml:space="preserve">AT&amp;T</w:t>
+      </w:r>
+      <w:r>
+        <w:t xml:space="preserve"> </w:t>
+      </w:r>
+      <w:r>
+        <w:t xml:space="preserve">– Plano, TX | September 1991–October 2020</w:t>
+      </w:r>
+    </w:p>
+    <w:p>
+      <w:pPr>
+        <w:pStyle w:val="BodyText"/>
+      </w:pPr>
+      <w:r>
+        <w:rPr>
+          <w:b/>
+          <w:bCs/>
+        </w:rPr>
+        <w:t xml:space="preserve">Director, Data Science &amp; Artificial Intelligence</w:t>
+      </w:r>
+      <w:r>
+        <w:t xml:space="preserve"> </w:t>
+      </w:r>
+      <w:r>
+        <w:t xml:space="preserve">| September 2017–October 2020</w:t>
+      </w:r>
+    </w:p>
+    <w:p>
+      <w:pPr>
+        <w:pStyle w:val="BodyText"/>
+      </w:pPr>
+      <w:r>
+        <w:t xml:space="preserve">Hands-on architect and individual contributor leading enterprise-scale AI/ML solutions. Led 45-person cross-functional team, $9M annual labor budget, $10M+ recurring annual savings, $20M+ in initiative funding secured through SVP-level partnerships.</w:t>
+      </w:r>
+    </w:p>
+    <w:p>
+      <w:pPr>
+        <w:pStyle w:val="Compact"/>
+        <w:numPr>
+          <w:ilvl w:val="0"/>
+          <w:numId w:val="1009"/>
+        </w:numPr>
+      </w:pPr>
+      <w:r>
+        <w:t xml:space="preserve">Built</w:t>
+      </w:r>
+      <w:r>
+        <w:t xml:space="preserve"> </w:t>
+      </w:r>
+      <w:r>
+        <w:rPr>
+          <w:b/>
+          <w:bCs/>
+        </w:rPr>
+        <w:t xml:space="preserve">TAVI</w:t>
+      </w:r>
+      <w:r>
+        <w:t xml:space="preserve">, an NLP customer-service chatbot handling 10,000+ daily interactions at 92% accuracy. Cut costs $4.5M in 15 months and improved first-call resolution 30%. Python, TensorFlow, BERT, AWS Lambda, DynamoDB.</w:t>
+      </w:r>
+    </w:p>
+    <w:p>
+      <w:pPr>
+        <w:pStyle w:val="Compact"/>
+        <w:numPr>
+          <w:ilvl w:val="0"/>
+          <w:numId w:val="1009"/>
+        </w:numPr>
+      </w:pPr>
+      <w:r>
+        <w:t xml:space="preserve">Delivered</w:t>
+      </w:r>
+      <w:r>
+        <w:t xml:space="preserve"> </w:t>
+      </w:r>
+      <w:r>
+        <w:rPr>
+          <w:b/>
+          <w:bCs/>
+        </w:rPr>
+        <w:t xml:space="preserve">SNAP</w:t>
+      </w:r>
+      <w:r>
+        <w:t xml:space="preserve">, computer vision for field operations and the first cloud-native AI solution at AT&amp;T enterprise scale. Saved $5.8M annually and raised field productivity 30%. Python, Azure Computer Vision, Core ML.</w:t>
+      </w:r>
+    </w:p>
+    <w:p>
+      <w:pPr>
+        <w:pStyle w:val="Compact"/>
+        <w:numPr>
+          <w:ilvl w:val="0"/>
+          <w:numId w:val="1009"/>
+        </w:numPr>
+      </w:pPr>
+      <w:r>
+        <w:t xml:space="preserve">Architected</w:t>
+      </w:r>
+      <w:r>
+        <w:t xml:space="preserve"> </w:t>
+      </w:r>
+      <w:r>
+        <w:rPr>
+          <w:b/>
+          <w:bCs/>
+        </w:rPr>
+        <w:t xml:space="preserve">EasyBake</w:t>
+      </w:r>
+      <w:r>
+        <w:t xml:space="preserve">, a no-code chatbot platform on Azure with API and robotic-process-automation overlays into dozens of enterprise systems. Won three internal production customers.</w:t>
+      </w:r>
+    </w:p>
+    <w:p>
+      <w:pPr>
+        <w:pStyle w:val="Compact"/>
+        <w:numPr>
+          <w:ilvl w:val="0"/>
+          <w:numId w:val="1009"/>
+        </w:numPr>
+      </w:pPr>
+      <w:r>
+        <w:t xml:space="preserve">Designed</w:t>
+      </w:r>
+      <w:r>
+        <w:t xml:space="preserve"> </w:t>
+      </w:r>
+      <w:r>
+        <w:rPr>
+          <w:b/>
+          <w:bCs/>
+        </w:rPr>
+        <w:t xml:space="preserve">Label Quest</w:t>
+      </w:r>
+      <w:r>
+        <w:t xml:space="preserve">, a gamified human-in-the-loop labeling system adopted by dozens of internal data science teams, covering text, image, and video with live leaderboards, accuracy tracking, and consensus quality gates.</w:t>
+      </w:r>
+    </w:p>
+    <w:p>
+      <w:pPr>
+        <w:pStyle w:val="Compact"/>
+        <w:numPr>
+          <w:ilvl w:val="0"/>
+          <w:numId w:val="1009"/>
+        </w:numPr>
+      </w:pPr>
+      <w:r>
+        <w:t xml:space="preserve">Delivered 90+ proof-of-concept solutions over three years; security protocols, audits, and vulnerability remediation for all AI deployments.</w:t>
+      </w:r>
+    </w:p>
+    <w:p>
+      <w:pPr>
+        <w:pStyle w:val="FirstParagraph"/>
+      </w:pPr>
+      <w:r>
+        <w:rPr>
+          <w:b/>
+          <w:bCs/>
+        </w:rPr>
+        <w:t xml:space="preserve">Lead Member Technical Staff, Enterprise Architect</w:t>
+      </w:r>
+      <w:r>
+        <w:t xml:space="preserve"> </w:t>
+      </w:r>
+      <w:r>
+        <w:t xml:space="preserve">| May 2013–August 2017</w:t>
+      </w:r>
+    </w:p>
+    <w:p>
+      <w:pPr>
+        <w:pStyle w:val="Compact"/>
+        <w:numPr>
+          <w:ilvl w:val="0"/>
+          <w:numId w:val="1010"/>
+        </w:numPr>
+      </w:pPr>
+      <w:r>
+        <w:t xml:space="preserve">Founded and chaired the enterprise AI &amp; Data Science Architecture Review Board, establishing the governance gates AI systems passed through across business units of a Fortune 10 company. Evaluated frameworks, vendors, and architectures for security, interoperability, licensing, and cost. Drove Python and R to enterprise-approved status.</w:t>
+      </w:r>
+    </w:p>
+    <w:p>
+      <w:pPr>
+        <w:pStyle w:val="Compact"/>
+        <w:numPr>
+          <w:ilvl w:val="0"/>
+          <w:numId w:val="1010"/>
+        </w:numPr>
+      </w:pPr>
+      <w:r>
+        <w:t xml:space="preserve">Deployed and administered Stack Overflow Enterprise to 31,000 users, clearing Technical Architecture Board approval, security review, and privacy compliance.</w:t>
+      </w:r>
+    </w:p>
+    <w:p>
+      <w:pPr>
+        <w:pStyle w:val="Compact"/>
+        <w:numPr>
+          <w:ilvl w:val="0"/>
+          <w:numId w:val="1010"/>
+        </w:numPr>
+      </w:pPr>
+      <w:r>
+        <w:t xml:space="preserve">Managed ‘RCloud’, the internal data science platform, and led training on Python, R, APIs, and AI architectures.</w:t>
+      </w:r>
+    </w:p>
+    <w:p>
+      <w:pPr>
+        <w:pStyle w:val="Compact"/>
+        <w:numPr>
+          <w:ilvl w:val="0"/>
+          <w:numId w:val="1010"/>
+        </w:numPr>
+      </w:pPr>
+      <w:r>
+        <w:t xml:space="preserve">Led tech evaluations setting enterprise direction: R vs SAS, MicroStrategy vs Tableau, GitHub vs Atlassian, AWS vs Azure vs GCP.</w:t>
+      </w:r>
+    </w:p>
+    <w:p>
+      <w:pPr>
+        <w:pStyle w:val="FirstParagraph"/>
+      </w:pPr>
+      <w:r>
+        <w:rPr>
+          <w:b/>
+          <w:bCs/>
+        </w:rPr>
+        <w:t xml:space="preserve">Additional Roles (1991–2013)</w:t>
+      </w:r>
+    </w:p>
+    <w:p>
+      <w:pPr>
+        <w:pStyle w:val="BodyText"/>
+      </w:pPr>
+      <w:r>
+        <w:t xml:space="preserve">AT&amp;T Bell Labs R&amp;D (Holmdel, NJ; 1991–1995) • Director of Program Management, IP Backbone • Director of Emerging Video Services, Corporate Strategy • Network Operations &amp; Engineering • Wireless communications development (multiple patents) • Resolved year-long migration crisis with 100-fold efficiency improvement in 45 days • Secured SVP funding for AI initiatives.</w:t>
+      </w:r>
+    </w:p>
+    <w:bookmarkEnd w:id="18"/>
+    <w:bookmarkStart w:id="19" w:name="licensure"/>
     <w:p>
       <w:pPr>
         <w:pStyle w:val="Heading2"/>
       </w:pPr>
       <w:r>
-        <w:t xml:space="preserve">Professional Experience</w:t>
+        <w:t xml:space="preserve">Licensure</w:t>
       </w:r>
     </w:p>
     <w:p>
@@ -596,13 +1096,28 @@
           <w:b/>
           <w:bCs/>
         </w:rPr>
-        <w:t xml:space="preserve">THRIVETECH.AI</w:t>
-      </w:r>
-      <w:r>
-        <w:t xml:space="preserve"> </w:t>
-      </w:r>
-      <w:r>
-        <w:t xml:space="preserve">– Plano, TX | June 2022–present</w:t>
+        <w:t xml:space="preserve">Licensed Professional Engineer</w:t>
+      </w:r>
+      <w:r>
+        <w:t xml:space="preserve">—State of Texas</w:t>
+      </w:r>
+    </w:p>
+    <w:bookmarkEnd w:id="19"/>
+    <w:bookmarkStart w:id="20" w:name="certifications"/>
+    <w:p>
+      <w:pPr>
+        <w:pStyle w:val="Heading2"/>
+      </w:pPr>
+      <w:r>
+        <w:t xml:space="preserve">Certifications</w:t>
+      </w:r>
+    </w:p>
+    <w:p>
+      <w:pPr>
+        <w:pStyle w:val="FirstParagraph"/>
+      </w:pPr>
+      <w:r>
+        <w:t xml:space="preserve">AWS—7 Certifications including:</w:t>
       </w:r>
     </w:p>
     <w:p>
@@ -610,11 +1125,7 @@
         <w:pStyle w:val="BodyText"/>
       </w:pPr>
       <w:r>
-        <w:rPr>
-          <w:b/>
-          <w:bCs/>
-        </w:rPr>
-        <w:t xml:space="preserve">Founder &amp; President</w:t>
+        <w:t xml:space="preserve">Machine Learning–Specialty</w:t>
       </w:r>
     </w:p>
     <w:p>
@@ -622,78 +1133,7 @@
         <w:pStyle w:val="BodyText"/>
       </w:pPr>
       <w:r>
-        <w:t xml:space="preserve">Independent AI architecture practice and C2C consulting vehicle; holds the independent invention portfolio. Active products:</w:t>
-      </w:r>
-      <w:r>
-        <w:t xml:space="preserve"> </w:t>
-      </w:r>
-      <w:r>
-        <w:rPr>
-          <w:b/>
-          <w:bCs/>
-        </w:rPr>
-        <w:t xml:space="preserve">AssemblyZero</w:t>
-      </w:r>
-      <w:r>
-        <w:t xml:space="preserve">,</w:t>
-      </w:r>
-      <w:r>
-        <w:t xml:space="preserve"> </w:t>
-      </w:r>
-      <w:r>
-        <w:rPr>
-          <w:b/>
-          <w:bCs/>
-        </w:rPr>
-        <w:t xml:space="preserve">Hermes</w:t>
-      </w:r>
-      <w:r>
-        <w:t xml:space="preserve">,</w:t>
-      </w:r>
-      <w:r>
-        <w:t xml:space="preserve"> </w:t>
-      </w:r>
-      <w:r>
-        <w:rPr>
-          <w:b/>
-          <w:bCs/>
-        </w:rPr>
-        <w:t xml:space="preserve">Aletheia</w:t>
-      </w:r>
-      <w:r>
-        <w:t xml:space="preserve">,</w:t>
-      </w:r>
-      <w:r>
-        <w:t xml:space="preserve"> </w:t>
-      </w:r>
-      <w:r>
-        <w:rPr>
-          <w:b/>
-          <w:bCs/>
-        </w:rPr>
-        <w:t xml:space="preserve">Chiron</w:t>
-      </w:r>
-      <w:r>
-        <w:t xml:space="preserve"> </w:t>
-      </w:r>
-      <w:r>
-        <w:t xml:space="preserve">(AI governance study SaaS for IAPP AIGP preparation), and</w:t>
-      </w:r>
-      <w:r>
-        <w:t xml:space="preserve"> </w:t>
-      </w:r>
-      <w:r>
-        <w:rPr>
-          <w:b/>
-          <w:bCs/>
-        </w:rPr>
-        <w:t xml:space="preserve">Clio</w:t>
-      </w:r>
-      <w:r>
-        <w:t xml:space="preserve"> </w:t>
-      </w:r>
-      <w:r>
-        <w:t xml:space="preserve">(Chrome extension for extracting LLM conversations to structured JSON).</w:t>
+        <w:t xml:space="preserve">Solutions Architect–Professional</w:t>
       </w:r>
     </w:p>
     <w:p>
@@ -701,17 +1141,7 @@
         <w:pStyle w:val="BodyText"/>
       </w:pPr>
       <w:r>
-        <w:rPr>
-          <w:b/>
-          <w:bCs/>
-        </w:rPr>
-        <w:t xml:space="preserve">TEXAS DEPARTMENT OF TRANSPORTATION</w:t>
-      </w:r>
-      <w:r>
-        <w:t xml:space="preserve"> </w:t>
-      </w:r>
-      <w:r>
-        <w:t xml:space="preserve">– Austin, TX | September 2023–April 2024</w:t>
+        <w:t xml:space="preserve">Data Analytics–Specialty</w:t>
       </w:r>
     </w:p>
     <w:p>
@@ -719,47 +1149,131 @@
         <w:pStyle w:val="BodyText"/>
       </w:pPr>
       <w:r>
-        <w:rPr>
-          <w:b/>
-          <w:bCs/>
-        </w:rPr>
-        <w:t xml:space="preserve">AI Strategic Consultant</w:t>
-      </w:r>
-    </w:p>
-    <w:p>
-      <w:pPr>
-        <w:pStyle w:val="Compact"/>
-        <w:numPr>
-          <w:ilvl w:val="0"/>
-          <w:numId w:val="1007"/>
-        </w:numPr>
-      </w:pPr>
-      <w:r>
-        <w:t xml:space="preserve">Authored 76-page AI strategic plan encompassing 32 epics, 213 use cases, governance controls, risk assessments, and AI ethics framework for state-wide transportation agency.</w:t>
-      </w:r>
-    </w:p>
-    <w:p>
-      <w:pPr>
-        <w:pStyle w:val="Compact"/>
-        <w:numPr>
-          <w:ilvl w:val="0"/>
-          <w:numId w:val="1007"/>
-        </w:numPr>
-      </w:pPr>
-      <w:r>
-        <w:t xml:space="preserve">Conducted stakeholder interviews across every division and district; applied LDA topic modeling to surface themes and identify high-priority AI applications meeting federal and state regulatory requirements.</w:t>
-      </w:r>
-    </w:p>
-    <w:p>
-      <w:pPr>
-        <w:pStyle w:val="Compact"/>
-        <w:numPr>
-          <w:ilvl w:val="0"/>
-          <w:numId w:val="1007"/>
-        </w:numPr>
-      </w:pPr>
-      <w:r>
-        <w:t xml:space="preserve">Translated technical AI capabilities into business-value propositions for non-technical executives; established phased implementation roadmaps balancing feasibility, compliance, and organizational change.</w:t>
+        <w:t xml:space="preserve">Data Engineer Associate</w:t>
+      </w:r>
+    </w:p>
+    <w:p>
+      <w:pPr>
+        <w:pStyle w:val="BodyText"/>
+      </w:pPr>
+      <w:r>
+        <w:t xml:space="preserve">Microsoft Azure:</w:t>
+      </w:r>
+    </w:p>
+    <w:p>
+      <w:pPr>
+        <w:pStyle w:val="BodyText"/>
+      </w:pPr>
+      <w:r>
+        <w:t xml:space="preserve">DevOps Engineer Expert</w:t>
+      </w:r>
+    </w:p>
+    <w:p>
+      <w:pPr>
+        <w:pStyle w:val="BodyText"/>
+      </w:pPr>
+      <w:r>
+        <w:t xml:space="preserve">AI Fundamentals</w:t>
+      </w:r>
+    </w:p>
+    <w:p>
+      <w:pPr>
+        <w:pStyle w:val="BodyText"/>
+      </w:pPr>
+      <w:r>
+        <w:t xml:space="preserve">Security, Compliance &amp; Identity Fundamentals</w:t>
+      </w:r>
+    </w:p>
+    <w:p>
+      <w:pPr>
+        <w:pStyle w:val="BodyText"/>
+      </w:pPr>
+      <w:r>
+        <w:rPr>
+          <w:b/>
+          <w:bCs/>
+        </w:rPr>
+        <w:t xml:space="preserve">CISSP</w:t>
+      </w:r>
+      <w:r>
+        <w:t xml:space="preserve"> </w:t>
+      </w:r>
+      <w:r>
+        <w:t xml:space="preserve">&amp;</w:t>
+      </w:r>
+      <w:r>
+        <w:t xml:space="preserve"> </w:t>
+      </w:r>
+      <w:r>
+        <w:rPr>
+          <w:b/>
+          <w:bCs/>
+        </w:rPr>
+        <w:t xml:space="preserve">CCSP</w:t>
+      </w:r>
+      <w:r>
+        <w:t xml:space="preserve">—ISC2</w:t>
+      </w:r>
+      <w:r>
+        <w:t xml:space="preserve"> </w:t>
+      </w:r>
+      <w:r>
+        <w:t xml:space="preserve">|</w:t>
+      </w:r>
+      <w:r>
+        <w:t xml:space="preserve"> </w:t>
+      </w:r>
+      <w:r>
+        <w:rPr>
+          <w:b/>
+          <w:bCs/>
+        </w:rPr>
+        <w:t xml:space="preserve">PMP</w:t>
+      </w:r>
+      <w:r>
+        <w:t xml:space="preserve"> </w:t>
+      </w:r>
+      <w:r>
+        <w:t xml:space="preserve">&amp;</w:t>
+      </w:r>
+      <w:r>
+        <w:t xml:space="preserve"> </w:t>
+      </w:r>
+      <w:r>
+        <w:rPr>
+          <w:b/>
+          <w:bCs/>
+        </w:rPr>
+        <w:t xml:space="preserve">PgMP</w:t>
+      </w:r>
+      <w:r>
+        <w:t xml:space="preserve">—PMI</w:t>
+      </w:r>
+      <w:r>
+        <w:t xml:space="preserve"> </w:t>
+      </w:r>
+      <w:r>
+        <w:t xml:space="preserve">|</w:t>
+      </w:r>
+      <w:r>
+        <w:t xml:space="preserve"> </w:t>
+      </w:r>
+      <w:r>
+        <w:rPr>
+          <w:b/>
+          <w:bCs/>
+        </w:rPr>
+        <w:t xml:space="preserve">Wireless Communications Professional (WCP)</w:t>
+      </w:r>
+    </w:p>
+    <w:bookmarkEnd w:id="20"/>
+    <w:bookmarkStart w:id="21" w:name="education"/>
+    <w:p>
+      <w:pPr>
+        <w:pStyle w:val="Heading2"/>
+      </w:pPr>
+      <w:r>
+        <w:t xml:space="preserve">Education</w:t>
       </w:r>
     </w:p>
     <w:p>
@@ -767,17 +1281,10 @@
         <w:pStyle w:val="FirstParagraph"/>
       </w:pPr>
       <w:r>
-        <w:rPr>
-          <w:b/>
-          <w:bCs/>
-        </w:rPr>
-        <w:t xml:space="preserve">AFINITI</w:t>
-      </w:r>
-      <w:r>
-        <w:t xml:space="preserve"> </w:t>
-      </w:r>
-      <w:r>
-        <w:t xml:space="preserve">– Washington, DC | March 2021–June 2022</w:t>
+        <w:t xml:space="preserve">Master of Computer Science</w:t>
+      </w:r>
+      <w:r>
+        <w:t xml:space="preserve">, University of Illinois Urbana-Champaign (2017)</w:t>
       </w:r>
     </w:p>
     <w:p>
@@ -785,11 +1292,10 @@
         <w:pStyle w:val="BodyText"/>
       </w:pPr>
       <w:r>
-        <w:rPr>
-          <w:b/>
-          <w:bCs/>
-        </w:rPr>
-        <w:t xml:space="preserve">Vice President, Product</w:t>
+        <w:t xml:space="preserve">Master of Science, Electrical Engineering</w:t>
+      </w:r>
+      <w:r>
+        <w:t xml:space="preserve">, University of Maryland, College Park</w:t>
       </w:r>
     </w:p>
     <w:p>
@@ -797,43 +1303,20 @@
         <w:pStyle w:val="BodyText"/>
       </w:pPr>
       <w:r>
-        <w:t xml:space="preserve">Product and security leadership for AI-powered customer-agent pairing platform optimizing enterprise contact center operations through behavioral analytics and machine learning.</w:t>
-      </w:r>
-    </w:p>
-    <w:p>
-      <w:pPr>
-        <w:pStyle w:val="Compact"/>
-        <w:numPr>
-          <w:ilvl w:val="0"/>
-          <w:numId w:val="1008"/>
-        </w:numPr>
-      </w:pPr>
-      <w:r>
-        <w:t xml:space="preserve">Led security architecture initiatives on a ~1M-line, 10-year-old C/C++ codebase: SonarQube vulnerability remediation, penetration test remediation, architecture reviews, API security hardening.</w:t>
-      </w:r>
-    </w:p>
-    <w:p>
-      <w:pPr>
-        <w:pStyle w:val="Compact"/>
-        <w:numPr>
-          <w:ilvl w:val="0"/>
-          <w:numId w:val="1008"/>
-        </w:numPr>
-      </w:pPr>
-      <w:r>
-        <w:t xml:space="preserve">Defined cross-functional product development processes spanning engineering, AI research, MLOps, and go-to-market. Hands-on DevOps across GCP and Azure (Docker, Jira, CI/CD).</w:t>
-      </w:r>
-    </w:p>
-    <w:p>
-      <w:pPr>
-        <w:pStyle w:val="Compact"/>
-        <w:numPr>
-          <w:ilvl w:val="0"/>
-          <w:numId w:val="1008"/>
-        </w:numPr>
-      </w:pPr>
-      <w:r>
-        <w:t xml:space="preserve">Set product strategy and prioritization across quarterly and sprint planning cycles, balancing ML algorithm investment against operational improvements and production issues.</w:t>
+        <w:t xml:space="preserve">Bachelor of Science, Electrical Engineering</w:t>
+      </w:r>
+      <w:r>
+        <w:t xml:space="preserve">, University of Maryland, College Park</w:t>
+      </w:r>
+    </w:p>
+    <w:bookmarkEnd w:id="21"/>
+    <w:bookmarkStart w:id="22" w:name="professional-memberships"/>
+    <w:p>
+      <w:pPr>
+        <w:pStyle w:val="Heading2"/>
+      </w:pPr>
+      <w:r>
+        <w:t xml:space="preserve">Professional Memberships</w:t>
       </w:r>
     </w:p>
     <w:p>
@@ -841,131 +1324,41 @@
         <w:pStyle w:val="FirstParagraph"/>
       </w:pPr>
       <w:r>
-        <w:rPr>
-          <w:b/>
-          <w:bCs/>
-        </w:rPr>
-        <w:t xml:space="preserve">AT&amp;T</w:t>
-      </w:r>
-      <w:r>
-        <w:t xml:space="preserve"> </w:t>
-      </w:r>
-      <w:r>
-        <w:t xml:space="preserve">– Plano, TX | September 1991–October 2020</w:t>
-      </w:r>
-    </w:p>
-    <w:p>
-      <w:pPr>
-        <w:pStyle w:val="BodyText"/>
-      </w:pPr>
-      <w:r>
-        <w:rPr>
-          <w:b/>
-          <w:bCs/>
-        </w:rPr>
-        <w:t xml:space="preserve">Director, Data Science &amp; Artificial Intelligence</w:t>
-      </w:r>
-      <w:r>
-        <w:t xml:space="preserve"> </w:t>
-      </w:r>
-      <w:r>
-        <w:t xml:space="preserve">| September 2017–October 2020</w:t>
-      </w:r>
-    </w:p>
-    <w:p>
-      <w:pPr>
-        <w:pStyle w:val="BodyText"/>
-      </w:pPr>
-      <w:r>
-        <w:t xml:space="preserve">Hands-on architect and individual contributor leading enterprise-scale AI/ML solutions. Led 45-person cross-functional team, $9M annual labor budget, $10M+ recurring annual savings, $20M+ in initiative funding secured through SVP-level partnerships.</w:t>
-      </w:r>
-    </w:p>
-    <w:p>
-      <w:pPr>
-        <w:pStyle w:val="Compact"/>
-        <w:numPr>
-          <w:ilvl w:val="0"/>
-          <w:numId w:val="1009"/>
-        </w:numPr>
-      </w:pPr>
-      <w:r>
-        <w:rPr>
-          <w:b/>
-          <w:bCs/>
-        </w:rPr>
-        <w:t xml:space="preserve">TAVI</w:t>
-      </w:r>
-      <w:r>
-        <w:t xml:space="preserve">—NLP customer-service chatbot (Python, TensorFlow, BERT, AWS Lambda, DynamoDB). 10,000+ daily interactions at 92% accuracy. Reduced costs $4.5M in 15 months; 30% first-call resolution improvement.</w:t>
-      </w:r>
-    </w:p>
-    <w:p>
-      <w:pPr>
-        <w:pStyle w:val="Compact"/>
-        <w:numPr>
-          <w:ilvl w:val="0"/>
-          <w:numId w:val="1009"/>
-        </w:numPr>
-      </w:pPr>
-      <w:r>
-        <w:rPr>
-          <w:b/>
-          <w:bCs/>
-        </w:rPr>
-        <w:t xml:space="preserve">SNAP</w:t>
-      </w:r>
-      <w:r>
-        <w:t xml:space="preserve">—computer vision for field operations (Python, Azure CV, Core ML, Azure DevOps). First cloud-native AI solution at AT&amp;T enterprise scale. $5.8M annual savings; 30% field productivity improvement.</w:t>
-      </w:r>
-    </w:p>
-    <w:p>
-      <w:pPr>
-        <w:pStyle w:val="Compact"/>
-        <w:numPr>
-          <w:ilvl w:val="0"/>
-          <w:numId w:val="1009"/>
-        </w:numPr>
-      </w:pPr>
-      <w:r>
-        <w:rPr>
-          <w:b/>
-          <w:bCs/>
-        </w:rPr>
-        <w:t xml:space="preserve">EasyBake</w:t>
-      </w:r>
-      <w:r>
-        <w:t xml:space="preserve">—no-code chatbot platform on Azure with API and RPA overlays to dozens of AT&amp;T enterprise systems. Three internal production customers. Pre-LLM conversational AI architecture.</w:t>
-      </w:r>
-    </w:p>
-    <w:p>
-      <w:pPr>
-        <w:pStyle w:val="Compact"/>
-        <w:numPr>
-          <w:ilvl w:val="0"/>
-          <w:numId w:val="1009"/>
-        </w:numPr>
-      </w:pPr>
-      <w:r>
-        <w:rPr>
-          <w:b/>
-          <w:bCs/>
-        </w:rPr>
-        <w:t xml:space="preserve">Label Quest</w:t>
-      </w:r>
-      <w:r>
-        <w:t xml:space="preserve">—gamified human-in-the-loop labeling system used by dozens of internal data science teams, supporting text, image, and video labeling with real-time leaderboards, accuracy tracking, and consensus quality gates.</w:t>
-      </w:r>
-    </w:p>
-    <w:p>
-      <w:pPr>
-        <w:pStyle w:val="Compact"/>
-        <w:numPr>
-          <w:ilvl w:val="0"/>
-          <w:numId w:val="1009"/>
-        </w:numPr>
-      </w:pPr>
-      <w:r>
-        <w:t xml:space="preserve">Delivered 90+ proof-of-concept solutions over three years; security protocols, audits, and vulnerability remediation for all AI deployments.</w:t>
+        <w:t xml:space="preserve">IEEE Senior Member •</w:t>
+      </w:r>
+      <w:r>
+        <w:t xml:space="preserve"> </w:t>
+      </w:r>
+      <w:r>
+        <w:t xml:space="preserve">International Association of Privacy Professionals (IAPP) •</w:t>
+      </w:r>
+      <w:r>
+        <w:t xml:space="preserve"> </w:t>
+      </w:r>
+      <w:r>
+        <w:t xml:space="preserve">ISC2 •</w:t>
+      </w:r>
+      <w:r>
+        <w:t xml:space="preserve"> </w:t>
+      </w:r>
+      <w:r>
+        <w:t xml:space="preserve">Project Management Institute (PMI) •</w:t>
+      </w:r>
+      <w:r>
+        <w:t xml:space="preserve"> </w:t>
+      </w:r>
+      <w:r>
+        <w:t xml:space="preserve">Open Worldwide Application Security Project (OWASP)</w:t>
+      </w:r>
+    </w:p>
+    <w:bookmarkEnd w:id="22"/>
+    <w:bookmarkStart w:id="23" w:name="patents"/>
+    <w:p>
+      <w:pPr>
+        <w:pStyle w:val="Heading2"/>
+      </w:pPr>
+      <w:r>
+        <w:t xml:space="preserve">Patents</w:t>
       </w:r>
     </w:p>
     <w:p>
@@ -977,409 +1370,16 @@
           <w:b/>
           <w:bCs/>
         </w:rPr>
-        <w:t xml:space="preserve">Lead Member Technical Staff, Enterprise Architect</w:t>
-      </w:r>
-      <w:r>
-        <w:t xml:space="preserve"> </w:t>
-      </w:r>
-      <w:r>
-        <w:t xml:space="preserve">| May 2013–August 2017</w:t>
-      </w:r>
-    </w:p>
-    <w:p>
-      <w:pPr>
-        <w:pStyle w:val="Compact"/>
-        <w:numPr>
-          <w:ilvl w:val="0"/>
-          <w:numId w:val="1010"/>
-        </w:numPr>
-      </w:pPr>
-      <w:r>
-        <w:t xml:space="preserve">Founding chair of the AI &amp; Data Science Architecture Review Board (described in Section above).</w:t>
-      </w:r>
-    </w:p>
-    <w:p>
-      <w:pPr>
-        <w:pStyle w:val="Compact"/>
-        <w:numPr>
-          <w:ilvl w:val="0"/>
-          <w:numId w:val="1010"/>
-        </w:numPr>
-      </w:pPr>
-      <w:r>
-        <w:t xml:space="preserve">Product manager for ‘RCloud’ internal data science platform; led training on Python, R, APIs, and AI architectures.</w:t>
-      </w:r>
-    </w:p>
-    <w:p>
-      <w:pPr>
-        <w:pStyle w:val="Compact"/>
-        <w:numPr>
-          <w:ilvl w:val="0"/>
-          <w:numId w:val="1010"/>
-        </w:numPr>
-      </w:pPr>
-      <w:r>
-        <w:t xml:space="preserve">Led tech evaluations setting enterprise direction: R vs SAS, MicroStrategy vs Tableau, GitHub vs Atlassian, AWS vs Azure vs GCP.</w:t>
-      </w:r>
-    </w:p>
-    <w:p>
-      <w:pPr>
-        <w:pStyle w:val="FirstParagraph"/>
-      </w:pPr>
-      <w:r>
-        <w:rPr>
-          <w:b/>
-          <w:bCs/>
-        </w:rPr>
-        <w:t xml:space="preserve">Additional Roles (1991–2013)</w:t>
-      </w:r>
-    </w:p>
-    <w:p>
-      <w:pPr>
-        <w:pStyle w:val="BodyText"/>
-      </w:pPr>
-      <w:r>
-        <w:t xml:space="preserve">AT&amp;T Bell Labs R&amp;D (Holmdel, NJ; 1991–1995) • Director of Program Management, IP Backbone • Director of Emerging Video Services, Corporate Strategy • Network Operations &amp; Engineering • Wireless communications development (multiple patents) • Resolved year-long migration crisis with 100-fold efficiency improvement in 45 days • Secured SVP funding for AI initiatives.</w:t>
-      </w:r>
-    </w:p>
-    <w:bookmarkEnd w:id="17"/>
-    <w:bookmarkStart w:id="18" w:name="licensure"/>
-    <w:p>
-      <w:pPr>
-        <w:pStyle w:val="Heading2"/>
-      </w:pPr>
-      <w:r>
-        <w:t xml:space="preserve">Licensure</w:t>
-      </w:r>
-    </w:p>
-    <w:p>
-      <w:pPr>
-        <w:pStyle w:val="FirstParagraph"/>
-      </w:pPr>
-      <w:r>
-        <w:rPr>
-          <w:b/>
-          <w:bCs/>
-        </w:rPr>
-        <w:t xml:space="preserve">Licensed Professional Engineer</w:t>
-      </w:r>
-      <w:r>
-        <w:t xml:space="preserve">—State of Texas</w:t>
-      </w:r>
-    </w:p>
-    <w:bookmarkEnd w:id="18"/>
-    <w:bookmarkStart w:id="19" w:name="certifications"/>
-    <w:p>
-      <w:pPr>
-        <w:pStyle w:val="Heading2"/>
-      </w:pPr>
-      <w:r>
-        <w:t xml:space="preserve">Certifications</w:t>
-      </w:r>
-    </w:p>
-    <w:p>
-      <w:pPr>
-        <w:pStyle w:val="FirstParagraph"/>
-      </w:pPr>
-      <w:r>
-        <w:t xml:space="preserve">AWS—7 Certifications including:</w:t>
-      </w:r>
-    </w:p>
-    <w:p>
-      <w:pPr>
-        <w:pStyle w:val="BodyText"/>
-      </w:pPr>
-      <w:r>
-        <w:t xml:space="preserve">Machine Learning–Specialty</w:t>
-      </w:r>
-    </w:p>
-    <w:p>
-      <w:pPr>
-        <w:pStyle w:val="BodyText"/>
-      </w:pPr>
-      <w:r>
-        <w:t xml:space="preserve">Solutions Architect–Professional</w:t>
-      </w:r>
-    </w:p>
-    <w:p>
-      <w:pPr>
-        <w:pStyle w:val="BodyText"/>
-      </w:pPr>
-      <w:r>
-        <w:t xml:space="preserve">Data Analytics–Specialty</w:t>
-      </w:r>
-    </w:p>
-    <w:p>
-      <w:pPr>
-        <w:pStyle w:val="BodyText"/>
-      </w:pPr>
-      <w:r>
-        <w:t xml:space="preserve">Data Engineer Associate</w:t>
-      </w:r>
-    </w:p>
-    <w:p>
-      <w:pPr>
-        <w:pStyle w:val="BodyText"/>
-      </w:pPr>
-      <w:r>
-        <w:t xml:space="preserve">Microsoft Azure:</w:t>
-      </w:r>
-    </w:p>
-    <w:p>
-      <w:pPr>
-        <w:pStyle w:val="BodyText"/>
-      </w:pPr>
-      <w:r>
-        <w:t xml:space="preserve">DevOps Engineer Expert</w:t>
-      </w:r>
-    </w:p>
-    <w:p>
-      <w:pPr>
-        <w:pStyle w:val="BodyText"/>
-      </w:pPr>
-      <w:r>
-        <w:t xml:space="preserve">AI Fundamentals</w:t>
-      </w:r>
-    </w:p>
-    <w:p>
-      <w:pPr>
-        <w:pStyle w:val="BodyText"/>
-      </w:pPr>
-      <w:r>
-        <w:t xml:space="preserve">Security, Compliance &amp; Identity Fundamentals</w:t>
-      </w:r>
-    </w:p>
-    <w:p>
-      <w:pPr>
-        <w:pStyle w:val="BodyText"/>
-      </w:pPr>
-      <w:r>
-        <w:rPr>
-          <w:b/>
-          <w:bCs/>
-        </w:rPr>
-        <w:t xml:space="preserve">CISSP</w:t>
-      </w:r>
-      <w:r>
-        <w:t xml:space="preserve"> </w:t>
-      </w:r>
-      <w:r>
-        <w:t xml:space="preserve">&amp;</w:t>
-      </w:r>
-      <w:r>
-        <w:t xml:space="preserve"> </w:t>
-      </w:r>
-      <w:r>
-        <w:rPr>
-          <w:b/>
-          <w:bCs/>
-        </w:rPr>
-        <w:t xml:space="preserve">CCSP</w:t>
-      </w:r>
-      <w:r>
-        <w:t xml:space="preserve">—(ISC)²</w:t>
-      </w:r>
-      <w:r>
-        <w:t xml:space="preserve"> </w:t>
-      </w:r>
-      <w:r>
-        <w:t xml:space="preserve">|</w:t>
-      </w:r>
-      <w:r>
-        <w:t xml:space="preserve"> </w:t>
-      </w:r>
-      <w:r>
-        <w:rPr>
-          <w:b/>
-          <w:bCs/>
-        </w:rPr>
-        <w:t xml:space="preserve">PMP</w:t>
-      </w:r>
-      <w:r>
-        <w:t xml:space="preserve"> </w:t>
-      </w:r>
-      <w:r>
-        <w:t xml:space="preserve">&amp;</w:t>
-      </w:r>
-      <w:r>
-        <w:t xml:space="preserve"> </w:t>
-      </w:r>
-      <w:r>
-        <w:rPr>
-          <w:b/>
-          <w:bCs/>
-        </w:rPr>
-        <w:t xml:space="preserve">PgMP</w:t>
-      </w:r>
-      <w:r>
-        <w:t xml:space="preserve">—PMI</w:t>
-      </w:r>
-      <w:r>
-        <w:t xml:space="preserve"> </w:t>
-      </w:r>
-      <w:r>
-        <w:t xml:space="preserve">|</w:t>
-      </w:r>
-      <w:r>
-        <w:t xml:space="preserve"> </w:t>
-      </w:r>
-      <w:r>
-        <w:rPr>
-          <w:b/>
-          <w:bCs/>
-        </w:rPr>
-        <w:t xml:space="preserve">IEEE Senior Member</w:t>
-      </w:r>
-      <w:r>
-        <w:t xml:space="preserve"> </w:t>
-      </w:r>
-      <w:r>
-        <w:t xml:space="preserve">&amp;</w:t>
-      </w:r>
-      <w:r>
-        <w:t xml:space="preserve"> </w:t>
-      </w:r>
-      <w:r>
-        <w:rPr>
-          <w:b/>
-          <w:bCs/>
-        </w:rPr>
-        <w:t xml:space="preserve">Wireless Communications Professional (WCP)</w:t>
-      </w:r>
-    </w:p>
-    <w:bookmarkEnd w:id="19"/>
-    <w:bookmarkStart w:id="20" w:name="education"/>
-    <w:p>
-      <w:pPr>
-        <w:pStyle w:val="Heading2"/>
-      </w:pPr>
-      <w:r>
-        <w:t xml:space="preserve">Education</w:t>
-      </w:r>
-    </w:p>
-    <w:p>
-      <w:pPr>
-        <w:pStyle w:val="FirstParagraph"/>
-      </w:pPr>
-      <w:r>
-        <w:t xml:space="preserve">Master of Computer Science</w:t>
-      </w:r>
-      <w:r>
-        <w:t xml:space="preserve">, University of Illinois Urbana-Champaign (2017)</w:t>
-      </w:r>
-    </w:p>
-    <w:p>
-      <w:pPr>
-        <w:pStyle w:val="BodyText"/>
-      </w:pPr>
-      <w:r>
-        <w:t xml:space="preserve">Master of Science, Electrical Engineering</w:t>
-      </w:r>
-      <w:r>
-        <w:t xml:space="preserve">, University of Maryland, College Park</w:t>
-      </w:r>
-    </w:p>
-    <w:p>
-      <w:pPr>
-        <w:pStyle w:val="BodyText"/>
-      </w:pPr>
-      <w:r>
-        <w:t xml:space="preserve">Bachelor of Science, Electrical Engineering</w:t>
-      </w:r>
-      <w:r>
-        <w:t xml:space="preserve">, University of Maryland, College Park</w:t>
-      </w:r>
-    </w:p>
-    <w:bookmarkEnd w:id="20"/>
-    <w:bookmarkStart w:id="21" w:name="professional-memberships"/>
-    <w:p>
-      <w:pPr>
-        <w:pStyle w:val="Heading2"/>
-      </w:pPr>
-      <w:r>
-        <w:t xml:space="preserve">Professional Memberships</w:t>
-      </w:r>
-    </w:p>
-    <w:p>
-      <w:pPr>
-        <w:pStyle w:val="FirstParagraph"/>
-      </w:pPr>
-      <w:r>
-        <w:t xml:space="preserve">IEEE Senior Member •</w:t>
-      </w:r>
-      <w:r>
-        <w:t xml:space="preserve"> </w:t>
-      </w:r>
-      <w:r>
-        <w:t xml:space="preserve">International Association of Privacy Professionals (IAPP) •</w:t>
-      </w:r>
-      <w:r>
-        <w:t xml:space="preserve"> </w:t>
-      </w:r>
-      <w:r>
-        <w:t xml:space="preserve">(ISC)² •</w:t>
-      </w:r>
-      <w:r>
-        <w:t xml:space="preserve"> </w:t>
-      </w:r>
-      <w:r>
-        <w:t xml:space="preserve">Project Management Institute (PMI) •</w:t>
-      </w:r>
-      <w:r>
-        <w:t xml:space="preserve"> </w:t>
-      </w:r>
-      <w:r>
-        <w:t xml:space="preserve">Open Worldwide Application Security Project (OWASP)</w:t>
-      </w:r>
-    </w:p>
-    <w:bookmarkEnd w:id="21"/>
-    <w:bookmarkStart w:id="22" w:name="patents"/>
-    <w:p>
-      <w:pPr>
-        <w:pStyle w:val="Heading2"/>
-      </w:pPr>
-      <w:r>
-        <w:t xml:space="preserve">Patents</w:t>
-      </w:r>
-    </w:p>
-    <w:p>
-      <w:pPr>
-        <w:pStyle w:val="FirstParagraph"/>
-      </w:pPr>
-      <w:r>
-        <w:rPr>
-          <w:b/>
-          <w:bCs/>
-        </w:rPr>
-        <w:t xml:space="preserve">Two U.S. Patents Filed 2026—AI Agent Safety.</w:t>
-      </w:r>
-      <w:r>
-        <w:t xml:space="preserve"> </w:t>
-      </w:r>
-      <w:r>
-        <w:t xml:space="preserve">Independent inventor and applicant; active applied research program in autonomous-agent permission and capability architecture.</w:t>
-      </w:r>
-      <w:r>
-        <w:br/>
-      </w:r>
-      <w:r>
-        <w:br/>
-      </w:r>
-      <w:r>
-        <w:rPr>
-          <w:b/>
-          <w:bCs/>
-        </w:rPr>
         <w:t xml:space="preserve">22 issued U.S. patents</w:t>
       </w:r>
       <w:r>
         <w:t xml:space="preserve"> </w:t>
       </w:r>
       <w:r>
-        <w:t xml:space="preserve">spanning AI, cloud computing, cybersecurity, IoT, and wireless communications, plus 9 pending applications. Domains include document analysis using ML and neural networks, customer service automation, sentiment detection, autonomous vehicle systems, edge network management, and biometric systems.</w:t>
-      </w:r>
-    </w:p>
-    <w:bookmarkEnd w:id="22"/>
+        <w:t xml:space="preserve">spanning AI, cloud computing, cybersecurity, IoT, and wireless communications, plus 9 pending applications and the two 2026 agent-safety filings. Domains include document analysis using ML and neural networks, customer service automation, sentiment detection, autonomous vehicle systems, edge network management, and biometric systems.</w:t>
+      </w:r>
+    </w:p>
+    <w:bookmarkEnd w:id="23"/>
     <w:sectPr>
       <w:footnotePr>
         <w:numRestart w:val="eachSect"/>

</xml_diff>

<commit_message>
Publish resume.docx again (Closes #44) (#45)
The site publishes the resume in three formats and resume.docx has returned 404
since 2026-07-31, because .assetsignore listed it. That line unpublishes a file
even while git tracks it, so the repo looked correct and the URL did not answer.
A downstream automation fetches all three formats for outbound email and drops
any that fails, which is why thirty-one days of sends carried two attachments
before anyone noticed.

The replacement comment names all three published formats and states that
listing any of them unpublishes it, so the next reader does not have to infer
the rule from one file's absence.

resume.docx also carried the 2026-06-08 build, three revisions behind. It now
holds the current one.

resume.html and resume.pdf keep their exact bytes and do not appear in this
diff.

Closes #44

Co-authored-by: Claude Opus 5 <noreply@anthropic.com>
</commit_message>
<xml_diff>
--- a/resume.docx
+++ b/resume.docx
@@ -71,13 +71,13 @@
       </w:hyperlink>
     </w:p>
     <w:bookmarkEnd w:id="12"/>
-    <w:bookmarkStart w:id="13" w:name="enterprise-agentic-ai-architect"/>
+    <w:bookmarkStart w:id="13" w:name="X20ff612211c722d62e5087db151f4e672c8092c"/>
     <w:p>
       <w:pPr>
         <w:pStyle w:val="Heading2"/>
       </w:pPr>
       <w:r>
-        <w:t xml:space="preserve">Enterprise Agentic AI Architect</w:t>
+        <w:t xml:space="preserve">Technology Executive—Artificial Intelligence</w:t>
       </w:r>
     </w:p>
     <w:p>
@@ -93,17 +93,17 @@
         <w:pStyle w:val="BodyText"/>
       </w:pPr>
       <w:r>
-        <w:t xml:space="preserve">Architects and governs enterprise agentic AI systems, with three production platforms in service: multi-agent orchestration with cross-vendor adversarial verification, autonomous conversational agents with layered evaluation, and consumer AI with defense-in-depth guardrails. IEEE service concentrated in AI readiness for critical infrastructure: Co-Chair of the IEEE PES Long Range Planning Committee Subcommittee 5 on Emerging Technologies, Digitalization, and AI Readiness; Vice Chair on the published IEEE-SA Industry Connections white paper IC25-004-01 on Grid Readiness for Data Center Deployment (January 2026); Section Chair and Editor on the forthcoming IC25-004-02 on Data Center Design for IT Load Protection. Two U.S. Patents Filed 2026 on AI Agent Safety; 22 issued U.S. patents across a 29-year career at Bell Labs and AT&amp;T including five years as Director of Data Science and Artificial Intelligence.</w:t>
+        <w:t xml:space="preserve">Technology executive who writes industry standards for artificial intelligence and builds production systems. Co-Chairs an emerging technologies subcommittee of the Long Range Planning Committee at the IEEE Power &amp; Energy Society, the world’s largest power engineering body. Directed data science and artificial intelligence at AT&amp;T across a 45-person organization, a $9M annual budget, and $10M in recurring annual savings. Holds 22 issued U.S. patents and filed two in 2026 on AI agent safety, ahead of the standards. Designs and ships production AI products through the Chrome Web Store, Mozilla Add-ons, and the Python Package Index. Licensed Professional Engineer.</w:t>
       </w:r>
     </w:p>
     <w:bookmarkEnd w:id="13"/>
-    <w:bookmarkStart w:id="14" w:name="agent-architecture-and-governance"/>
+    <w:bookmarkStart w:id="15" w:name="ieee-leadership-and-standards"/>
     <w:p>
       <w:pPr>
         <w:pStyle w:val="Heading2"/>
       </w:pPr>
       <w:r>
-        <w:t xml:space="preserve">Agent Architecture and Governance</w:t>
+        <w:t xml:space="preserve">IEEE Leadership and Standards</w:t>
       </w:r>
     </w:p>
     <w:p>
@@ -111,21 +111,17 @@
         <w:pStyle w:val="FirstParagraph"/>
       </w:pPr>
       <w:r>
-        <w:t xml:space="preserve">Three production agentic AI platforms publicly verifiable at</w:t>
-      </w:r>
-      <w:r>
-        <w:t xml:space="preserve"> </w:t>
-      </w:r>
-      <w:hyperlink r:id="rId11">
-        <w:r>
-          <w:rPr>
-            <w:rStyle w:val="Hyperlink"/>
-          </w:rPr>
-          <w:t xml:space="preserve">github.com/martymcenroe</w:t>
-        </w:r>
-      </w:hyperlink>
-      <w:r>
-        <w:t xml:space="preserve">—A+ contributor grade, 10,000+ contributions in the last year, 64 repositories contributed to.</w:t>
+        <w:rPr>
+          <w:b/>
+          <w:bCs/>
+        </w:rPr>
+        <w:t xml:space="preserve">Co-Chair, Emerging Technologies, Digitalization, and AI Readiness—IEEE Power &amp; Energy Society, Long Range Planning Committee</w:t>
+      </w:r>
+      <w:r>
+        <w:t xml:space="preserve"> </w:t>
+      </w:r>
+      <w:r>
+        <w:t xml:space="preserve">| 2026–present</w:t>
       </w:r>
     </w:p>
     <w:p>
@@ -133,351 +129,7 @@
         <w:pStyle w:val="BodyText"/>
       </w:pPr>
       <w:r>
-        <w:rPr>
-          <w:b/>
-          <w:bCs/>
-        </w:rPr>
-        <w:t xml:space="preserve">AssemblyZero—Multi-Agent Orchestration with Cross-Vendor Adversarial Verification</w:t>
-      </w:r>
-    </w:p>
-    <w:p>
-      <w:pPr>
-        <w:pStyle w:val="Compact"/>
-        <w:numPr>
-          <w:ilvl w:val="0"/>
-          <w:numId w:val="1001"/>
-        </w:numPr>
-      </w:pPr>
-      <w:r>
-        <w:t xml:space="preserve">Five-stage LangGraph StateGraph pipeline (Triage→Design→Spec→TDD→PR) coordinating 12+ concurrent Claude and Gemini agents with typed state, conditional routing, retry-with-backoff, and crash recovery via serialized checkpoints.</w:t>
-      </w:r>
-    </w:p>
-    <w:p>
-      <w:pPr>
-        <w:pStyle w:val="Compact"/>
-        <w:numPr>
-          <w:ilvl w:val="0"/>
-          <w:numId w:val="1001"/>
-        </w:numPr>
-      </w:pPr>
-      <w:r>
-        <w:t xml:space="preserve">Cross-vendor adversarial verification—Claude generates, Gemini reviews—catches hallucinations across model families.</w:t>
-      </w:r>
-    </w:p>
-    <w:p>
-      <w:pPr>
-        <w:pStyle w:val="Compact"/>
-        <w:numPr>
-          <w:ilvl w:val="0"/>
-          <w:numId w:val="1001"/>
-        </w:numPr>
-      </w:pPr>
-      <w:r>
-        <w:t xml:space="preserve">Five-layer evaluation framework: execution-based verification (pytest exit codes drive routing), AST structural analysis, cross-model review, stagnation detection, longitudinal learning from accumulated verdicts.</w:t>
-      </w:r>
-    </w:p>
-    <w:p>
-      <w:pPr>
-        <w:pStyle w:val="Compact"/>
-        <w:numPr>
-          <w:ilvl w:val="0"/>
-          <w:numId w:val="1001"/>
-        </w:numPr>
-      </w:pPr>
-      <w:r>
-        <w:t xml:space="preserve">740 issues processed, 88% closure rate, 434 pull requests merged, 5,583 tests. Stack: Python, LangGraph 1.0, DynamoDB, GitHub Actions.</w:t>
-      </w:r>
-    </w:p>
-    <w:p>
-      <w:pPr>
-        <w:pStyle w:val="FirstParagraph"/>
-      </w:pPr>
-      <w:r>
-        <w:rPr>
-          <w:b/>
-          <w:bCs/>
-        </w:rPr>
-        <w:t xml:space="preserve">Hermes—Autonomous Production Agent for Recruiter Triage</w:t>
-      </w:r>
-    </w:p>
-    <w:p>
-      <w:pPr>
-        <w:pStyle w:val="Compact"/>
-        <w:numPr>
-          <w:ilvl w:val="0"/>
-          <w:numId w:val="1002"/>
-        </w:numPr>
-      </w:pPr>
-      <w:r>
-        <w:t xml:space="preserve">Production autonomous email agent for recruiter triage on Cloudflare Workers + AWS Bedrock. Architectural safety: deterministic first-contact template—zero AI on the highest-stakes message—audit queue gating AI-proposed actions, 10-state conversation state machine with escalation triggers (legal threat, message-count overflow, VIP allowlist), and operator-takeover flag (is_human_managed) for manual control.</w:t>
-      </w:r>
-    </w:p>
-    <w:p>
-      <w:pPr>
-        <w:pStyle w:val="Compact"/>
-        <w:numPr>
-          <w:ilvl w:val="0"/>
-          <w:numId w:val="1002"/>
-        </w:numPr>
-      </w:pPr>
-      <w:r>
-        <w:t xml:space="preserve">Two-stage Bedrock pipeline on returning conversations: Haiku for intent classification + entity extraction (10 intents), Sonnet for generation with full context injection. 60-120 second human-like send delay.</w:t>
-      </w:r>
-    </w:p>
-    <w:p>
-      <w:pPr>
-        <w:pStyle w:val="Compact"/>
-        <w:numPr>
-          <w:ilvl w:val="0"/>
-          <w:numId w:val="1002"/>
-        </w:numPr>
-      </w:pPr>
-      <w:r>
-        <w:t xml:space="preserve">Pipeline of quality gates on every output: anti-hallucination, sensitive-data pattern detection, AI-disclosure prevention, hostile-tone (27-phrase blocklist). Hybrid-cloud boundary at SQS—Cloudflare Worker ingests + pre-retrieves RAG, AWS Lambda processes—chosen for autonomous-agent reliability: at-least-once delivery, retry-on-failure, dead-letter quarantine. Form-fill gated behind verified GitHub star.</w:t>
-      </w:r>
-    </w:p>
-    <w:p>
-      <w:pPr>
-        <w:pStyle w:val="Compact"/>
-        <w:numPr>
-          <w:ilvl w:val="0"/>
-          <w:numId w:val="1002"/>
-        </w:numPr>
-      </w:pPr>
-      <w:r>
-        <w:t xml:space="preserve">Stack: Cloudflare Workers, AWS Lambda, SQS, D1, Vectorize, R2, Bedrock, SES. ~$5-7/month at hundreds of messages.</w:t>
-      </w:r>
-    </w:p>
-    <w:p>
-      <w:pPr>
-        <w:pStyle w:val="FirstParagraph"/>
-      </w:pPr>
-      <w:r>
-        <w:rPr>
-          <w:b/>
-          <w:bCs/>
-        </w:rPr>
-        <w:t xml:space="preserve">Aletheia—Consumer AI with Layered Guardrails</w:t>
-      </w:r>
-    </w:p>
-    <w:p>
-      <w:pPr>
-        <w:pStyle w:val="Compact"/>
-        <w:numPr>
-          <w:ilvl w:val="0"/>
-          <w:numId w:val="1003"/>
-        </w:numPr>
-      </w:pPr>
-      <w:r>
-        <w:t xml:space="preserve">Seven-stage handler pipeline for consumer-facing AI product with independent short-circuiting at each stage. Two-layer guardrail system: deterministic denylist followed by semantic LLM classifier with five-category taxonomy returning confidence scores.</w:t>
-      </w:r>
-    </w:p>
-    <w:p>
-      <w:pPr>
-        <w:pStyle w:val="Compact"/>
-        <w:numPr>
-          <w:ilvl w:val="0"/>
-          <w:numId w:val="1003"/>
-        </w:numPr>
-      </w:pPr>
-      <w:r>
-        <w:t xml:space="preserve">Tiered model routing: Nova Micro screens for layered-meaning potential, Claude Opus performs deeper multi-dimensional analysis on user demand.</w:t>
-      </w:r>
-    </w:p>
-    <w:p>
-      <w:pPr>
-        <w:pStyle w:val="Compact"/>
-        <w:numPr>
-          <w:ilvl w:val="0"/>
-          <w:numId w:val="1003"/>
-        </w:numPr>
-      </w:pPr>
-      <w:r>
-        <w:t xml:space="preserve">Privacy-constrained observability—operational metadata only, no content logging.</w:t>
-      </w:r>
-    </w:p>
-    <w:p>
-      <w:pPr>
-        <w:pStyle w:val="Compact"/>
-        <w:numPr>
-          <w:ilvl w:val="0"/>
-          <w:numId w:val="1003"/>
-        </w:numPr>
-      </w:pPr>
-      <w:r>
-        <w:t xml:space="preserve">Stack: AWS Lambda, Bedrock, DynamoDB, CloudFront, Chrome and Firefox extensions.</w:t>
-      </w:r>
-    </w:p>
-    <w:p>
-      <w:pPr>
-        <w:pStyle w:val="FirstParagraph"/>
-      </w:pPr>
-      <w:r>
-        <w:rPr>
-          <w:b/>
-          <w:bCs/>
-        </w:rPr>
-        <w:t xml:space="preserve">Maieutics—Methodology and Tooling for AI-Assisted Technical Authorship</w:t>
-      </w:r>
-    </w:p>
-    <w:p>
-      <w:pPr>
-        <w:pStyle w:val="Compact"/>
-        <w:numPr>
-          <w:ilvl w:val="0"/>
-          <w:numId w:val="1004"/>
-        </w:numPr>
-      </w:pPr>
-      <w:r>
-        <w:t xml:space="preserve">Methodology and tooling for AI-assisted technical authorship at institutional scale. The workflow constrains AI use to assistance and forces substantive human contribution at every step, so the resulting work is defensibly the author's under inspection.</w:t>
-      </w:r>
-    </w:p>
-    <w:p>
-      <w:pPr>
-        <w:pStyle w:val="Compact"/>
-        <w:numPr>
-          <w:ilvl w:val="0"/>
-          <w:numId w:val="1004"/>
-        </w:numPr>
-      </w:pPr>
-      <w:r>
-        <w:t xml:space="preserve">Three core components: per-document audit-trail specification, semantic source-verification that catches paraphrase crossing into copying, and a workflow checklist mapping each step to demonstrable human contribution.</w:t>
-      </w:r>
-    </w:p>
-    <w:p>
-      <w:pPr>
-        <w:pStyle w:val="Compact"/>
-        <w:numPr>
-          <w:ilvl w:val="0"/>
-          <w:numId w:val="1004"/>
-        </w:numPr>
-      </w:pPr>
-      <w:r>
-        <w:t xml:space="preserve">Legal anchor: USPTO Inventorship Guidance for AI-Assisted Inventions and the Pannu v. Iolab Corp. significant-contribution analysis.</w:t>
-      </w:r>
-    </w:p>
-    <w:p>
-      <w:pPr>
-        <w:pStyle w:val="Compact"/>
-        <w:numPr>
-          <w:ilvl w:val="0"/>
-          <w:numId w:val="1004"/>
-        </w:numPr>
-      </w:pPr>
-      <w:r>
-        <w:t xml:space="preserve">Status: private preview, active development. License: PolyForm Noncommercial 1.0.0.</w:t>
-      </w:r>
-    </w:p>
-    <w:p>
-      <w:pPr>
-        <w:pStyle w:val="FirstParagraph"/>
-      </w:pPr>
-      <w:r>
-        <w:rPr>
-          <w:b/>
-          <w:bCs/>
-        </w:rPr>
-        <w:t xml:space="preserve">sentinel-rfc—Agent-Context Permission Bit Architecture</w:t>
-      </w:r>
-    </w:p>
-    <w:p>
-      <w:pPr>
-        <w:pStyle w:val="Compact"/>
-        <w:numPr>
-          <w:ilvl w:val="0"/>
-          <w:numId w:val="1005"/>
-        </w:numPr>
-      </w:pPr>
-      <w:r>
-        <w:t xml:space="preserve">Active applied research program proposing agent-context permission bits as an architectural alternative to the "agent inherits user permissions" model that creates excessive blast radius for autonomous agents.</w:t>
-      </w:r>
-    </w:p>
-    <w:p>
-      <w:pPr>
-        <w:pStyle w:val="Compact"/>
-        <w:numPr>
-          <w:ilvl w:val="0"/>
-          <w:numId w:val="1005"/>
-        </w:numPr>
-      </w:pPr>
-      <w:r>
-        <w:t xml:space="preserve">Scope includes manifest specification, capability authorization design, and prototype work targeting filesystem-level enforcement.</w:t>
-      </w:r>
-    </w:p>
-    <w:p>
-      <w:pPr>
-        <w:pStyle w:val="FirstParagraph"/>
-      </w:pPr>
-      <w:r>
-        <w:rPr>
-          <w:b/>
-          <w:bCs/>
-        </w:rPr>
-        <w:t xml:space="preserve">AI &amp; Data Science Architecture Review Board (AT&amp;T)—Enterprise Governance Precedent</w:t>
-      </w:r>
-    </w:p>
-    <w:p>
-      <w:pPr>
-        <w:pStyle w:val="Compact"/>
-        <w:numPr>
-          <w:ilvl w:val="0"/>
-          <w:numId w:val="1006"/>
-        </w:numPr>
-      </w:pPr>
-      <w:r>
-        <w:t xml:space="preserve">Founding chair of the enterprise AI and Data Science Architecture Review Board, establishing governance gates for AI systems across business units of a Fortune 10 enterprise.</w:t>
-      </w:r>
-    </w:p>
-    <w:p>
-      <w:pPr>
-        <w:pStyle w:val="Compact"/>
-        <w:numPr>
-          <w:ilvl w:val="0"/>
-          <w:numId w:val="1006"/>
-        </w:numPr>
-      </w:pPr>
-      <w:r>
-        <w:t xml:space="preserve">Evaluated frameworks, vendors, and architectures for security, interoperability, licensing, and cost. Drove standardization of Python and R as enterprise-approved languages.</w:t>
-      </w:r>
-    </w:p>
-    <w:p>
-      <w:pPr>
-        <w:pStyle w:val="Compact"/>
-        <w:numPr>
-          <w:ilvl w:val="0"/>
-          <w:numId w:val="1006"/>
-        </w:numPr>
-      </w:pPr>
-      <w:r>
-        <w:t xml:space="preserve">Deployed and administered Stack Overflow Enterprise to 31,000 users, navigating Technical Architecture Board approvals, security reviews, and privacy compliance.</w:t>
-      </w:r>
-    </w:p>
-    <w:bookmarkEnd w:id="14"/>
-    <w:bookmarkStart w:id="16" w:name="ieee-leadership-and-standards"/>
-    <w:p>
-      <w:pPr>
-        <w:pStyle w:val="Heading2"/>
-      </w:pPr>
-      <w:r>
-        <w:t xml:space="preserve">IEEE Leadership and Standards</w:t>
-      </w:r>
-    </w:p>
-    <w:p>
-      <w:pPr>
-        <w:pStyle w:val="FirstParagraph"/>
-      </w:pPr>
-      <w:r>
-        <w:rPr>
-          <w:b/>
-          <w:bCs/>
-        </w:rPr>
-        <w:t xml:space="preserve">Co-Chair, IEEE PES Long Range Planning Committee, Subcommittee 5</w:t>
-      </w:r>
-      <w:r>
-        <w:t xml:space="preserve"> </w:t>
-      </w:r>
-      <w:r>
-        <w:t xml:space="preserve">| 2026–present</w:t>
+        <w:t xml:space="preserve">Forecast the technologies reaching the power system over the next five to fifteen years, and advise the Society on where to act. Convene fourteen voting members drawn from industry, universities, and government across eight countries. Delivered the subcommittee’s Vision Document, its agenda for AI and digitalization in the power system: members reviewed candidate priorities and voted independently on each, adopting 234. Twelve areas now under investigation, among them trustworthy and certified AI, cyber-physical security, quantum computation, and autonomous closed-loop grid operation.</w:t>
       </w:r>
     </w:p>
     <w:p>
@@ -485,7 +137,17 @@
         <w:pStyle w:val="BodyText"/>
       </w:pPr>
       <w:r>
-        <w:t xml:space="preserve">Emerging Technologies, Digitalization, and AI Readiness. Reports to PES Governing Board via LRPC Chair (PES President-Elect). Vision Document due July 2026 PES General Meeting.</w:t>
+        <w:rPr>
+          <w:b/>
+          <w:bCs/>
+        </w:rPr>
+        <w:t xml:space="preserve">Officer and Lead Author, Data Centers and the Grid—IEEE Standards Association</w:t>
+      </w:r>
+      <w:r>
+        <w:t xml:space="preserve"> </w:t>
+      </w:r>
+      <w:r>
+        <w:t xml:space="preserve">| 2025–present</w:t>
       </w:r>
     </w:p>
     <w:p>
@@ -493,27 +155,9 @@
         <w:pStyle w:val="BodyText"/>
       </w:pPr>
       <w:r>
-        <w:rPr>
-          <w:b/>
-          <w:bCs/>
-        </w:rPr>
-        <w:t xml:space="preserve">Vice Chair, IC25-004-01—Industry Standards for Grid Readiness for Data Center Deployment</w:t>
-      </w:r>
-      <w:r>
-        <w:t xml:space="preserve"> </w:t>
-      </w:r>
-      <w:r>
-        <w:t xml:space="preserve">| 2025–2026</w:t>
-      </w:r>
-    </w:p>
-    <w:p>
-      <w:pPr>
-        <w:pStyle w:val="BodyText"/>
-      </w:pPr>
-      <w:r>
-        <w:t xml:space="preserve">IEEE-SA Industry Connections, Data Centers: Standards Needs Analysis and Recommendations. Published January 29, 2026 (</w:t>
-      </w:r>
-      <w:hyperlink r:id="rId15">
+        <w:t xml:space="preserve">Activity Secretary of the IEEE Standards Association program on data center growth, the sector’s most urgent capacity problem. Vice Chair of the first white paper, published January 2026 (</w:t>
+      </w:r>
+      <w:hyperlink r:id="rId14">
         <w:r>
           <w:rPr>
             <w:rStyle w:val="Hyperlink"/>
@@ -522,7 +166,7 @@
         </w:r>
       </w:hyperlink>
       <w:r>
-        <w:t xml:space="preserve">). Recommendations triggered an IEEE SETCom study group (approved February 26, 2026) developing Project Authorization Requests for five new IEEE standards on data center interconnection, performance, modeling, co-located generation, and flexibility.</w:t>
+        <w:t xml:space="preserve">). It triggered an IEEE study group that approved five new standards projects. One of four lead authors on the second paper, now in editorial review.</w:t>
       </w:r>
     </w:p>
     <w:p>
@@ -534,13 +178,13 @@
           <w:b/>
           <w:bCs/>
         </w:rPr>
-        <w:t xml:space="preserve">Section Chair and Editor, IC25-004-02 Section 5—Data Center Design for IT Load Protection</w:t>
-      </w:r>
-      <w:r>
-        <w:t xml:space="preserve"> </w:t>
-      </w:r>
-      <w:r>
-        <w:t xml:space="preserve">| 2025–2026</w:t>
+        <w:t xml:space="preserve">Standards Author and Working Group Member—IEEE Power &amp; Energy Society</w:t>
+      </w:r>
+      <w:r>
+        <w:t xml:space="preserve"> </w:t>
+      </w:r>
+      <w:r>
+        <w:t xml:space="preserve">| 2025–present</w:t>
       </w:r>
     </w:p>
     <w:p>
@@ -548,7 +192,487 @@
         <w:pStyle w:val="BodyText"/>
       </w:pPr>
       <w:r>
-        <w:t xml:space="preserve">Section 5: Consumption Patterns and Disturbance Response. IEEE-SA Industry Connections; publishing 2026.</w:t>
+        <w:t xml:space="preserve">Serve on four working groups across the security and data agenda. Authored the use-case section of the report on software bills of materials in the energy sector, grounded in federal guidance from the Cybersecurity and Infrastructure Security Agency, the National Security Agency, and NERC. Authored a section of the joint task force report naming which new communications standards should exist. Founding member of IEEE P4200, which sets the interconnection, performance, and interoperability requirements for attaching data centers to transmission and distribution systems. Contributing author on the large-load integration report.</w:t>
+      </w:r>
+    </w:p>
+    <w:bookmarkEnd w:id="15"/>
+    <w:bookmarkStart w:id="17" w:name="thrivetech.aiapplied-ai-portfolio"/>
+    <w:p>
+      <w:pPr>
+        <w:pStyle w:val="Heading2"/>
+      </w:pPr>
+      <w:r>
+        <w:t xml:space="preserve">ThriveTech.ai—Applied AI Portfolio</w:t>
+      </w:r>
+    </w:p>
+    <w:p>
+      <w:pPr>
+        <w:pStyle w:val="FirstParagraph"/>
+      </w:pPr>
+      <w:r>
+        <w:rPr>
+          <w:b/>
+          <w:bCs/>
+        </w:rPr>
+        <w:t xml:space="preserve">Multi-Agent Engineering Systems—AssemblyZero</w:t>
+      </w:r>
+    </w:p>
+    <w:p>
+      <w:pPr>
+        <w:pStyle w:val="Compact"/>
+        <w:numPr>
+          <w:ilvl w:val="0"/>
+          <w:numId w:val="1001"/>
+        </w:numPr>
+      </w:pPr>
+      <w:r>
+        <w:t xml:space="preserve">Built an engineering organization staffed by AI agents. AssemblyZero builds every product in this portfolio, and built and improves itself. Five stages run from triage through design, specification, test-driven development, and pull request, coordinating twelve or more concurrent agents with typed state, conditional routing, and crash recovery.</w:t>
+      </w:r>
+    </w:p>
+    <w:p>
+      <w:pPr>
+        <w:pStyle w:val="Compact"/>
+        <w:numPr>
+          <w:ilvl w:val="0"/>
+          <w:numId w:val="1001"/>
+        </w:numPr>
+      </w:pPr>
+      <w:r>
+        <w:t xml:space="preserve">Designed cross-vendor adversarial verification, the core idea: one vendor’s model writes the code, a different vendor’s model reviews it. Errors that survive one model rarely survive two trained by separate companies.</w:t>
+      </w:r>
+    </w:p>
+    <w:p>
+      <w:pPr>
+        <w:pStyle w:val="Compact"/>
+        <w:numPr>
+          <w:ilvl w:val="0"/>
+          <w:numId w:val="1001"/>
+        </w:numPr>
+      </w:pPr>
+      <w:r>
+        <w:t xml:space="preserve">Built five evaluation layers that every change must clear: test execution, structural analysis of the code, cross-model review, stagnation detection, and learning from accumulated verdicts.</w:t>
+      </w:r>
+    </w:p>
+    <w:p>
+      <w:pPr>
+        <w:pStyle w:val="Compact"/>
+        <w:numPr>
+          <w:ilvl w:val="0"/>
+          <w:numId w:val="1001"/>
+        </w:numPr>
+      </w:pPr>
+      <w:r>
+        <w:t xml:space="preserve">Processed 1,578 issues at a 91% closure rate, merged 1,031 pull requests, and grew the test suite to 9,982. Python, LangGraph, DynamoDB, GitHub Actions.</w:t>
+      </w:r>
+    </w:p>
+    <w:p>
+      <w:pPr>
+        <w:pStyle w:val="FirstParagraph"/>
+      </w:pPr>
+      <w:r>
+        <w:rPr>
+          <w:b/>
+          <w:bCs/>
+        </w:rPr>
+        <w:t xml:space="preserve">Adaptive Learning Systems—Chiron (chiron.thrivetech.ai)</w:t>
+      </w:r>
+    </w:p>
+    <w:p>
+      <w:pPr>
+        <w:pStyle w:val="Compact"/>
+        <w:numPr>
+          <w:ilvl w:val="0"/>
+          <w:numId w:val="1002"/>
+        </w:numPr>
+      </w:pPr>
+      <w:r>
+        <w:t xml:space="preserve">Built a live learning platform running eleven subject domains, from AI governance and patent law to real analysis, music theory, and amateur radio licensure.</w:t>
+      </w:r>
+    </w:p>
+    <w:p>
+      <w:pPr>
+        <w:pStyle w:val="Compact"/>
+        <w:numPr>
+          <w:ilvl w:val="0"/>
+          <w:numId w:val="1002"/>
+        </w:numPr>
+      </w:pPr>
+      <w:r>
+        <w:t xml:space="preserve">Designed a question generator that works from cited source material, classifies each item against Bloom’s Revised Taxonomy and Webb’s Depth of Knowledge, and tags every wrong answer with the specific misconception it represents under the SOLO taxonomy.</w:t>
+      </w:r>
+    </w:p>
+    <w:p>
+      <w:pPr>
+        <w:pStyle w:val="Compact"/>
+        <w:numPr>
+          <w:ilvl w:val="0"/>
+          <w:numId w:val="1002"/>
+        </w:numPr>
+      </w:pPr>
+      <w:r>
+        <w:t xml:space="preserve">Designed a knowledge model spanning all eleven domains instead of siloing them: a shared ontology, a prerequisite graph, and per-learner mastery state.</w:t>
+      </w:r>
+    </w:p>
+    <w:p>
+      <w:pPr>
+        <w:pStyle w:val="Compact"/>
+        <w:numPr>
+          <w:ilvl w:val="0"/>
+          <w:numId w:val="1002"/>
+        </w:numPr>
+      </w:pPr>
+      <w:r>
+        <w:t xml:space="preserve">Ensured no learner meets a question resting on a concept they have not established. Introduces and teaches new concepts at the learner’s knowledge frontier. Ranked selection by unseen material, then by decayed per-concept mastery.</w:t>
+      </w:r>
+    </w:p>
+    <w:p>
+      <w:pPr>
+        <w:pStyle w:val="Compact"/>
+        <w:numPr>
+          <w:ilvl w:val="0"/>
+          <w:numId w:val="1002"/>
+        </w:numPr>
+      </w:pPr>
+      <w:r>
+        <w:t xml:space="preserve">Wrote the research behind it, a cross-domain study of which cognitive frameworks survive automated question generation, including where Bloom’s levels alone let a model produce an item that only looks analytical.</w:t>
+      </w:r>
+    </w:p>
+    <w:p>
+      <w:pPr>
+        <w:pStyle w:val="FirstParagraph"/>
+      </w:pPr>
+      <w:r>
+        <w:rPr>
+          <w:b/>
+          <w:bCs/>
+        </w:rPr>
+        <w:t xml:space="preserve">Language and Culture—thetrail.online</w:t>
+      </w:r>
+    </w:p>
+    <w:p>
+      <w:pPr>
+        <w:pStyle w:val="Compact"/>
+        <w:numPr>
+          <w:ilvl w:val="0"/>
+          <w:numId w:val="1003"/>
+        </w:numPr>
+      </w:pPr>
+      <w:r>
+        <w:t xml:space="preserve">Built a subscription product that teaches language and culture along real long-distance walks, opening with the Camino Francés in Spanish. A walker moves stage by stage; encounters recur; the vocabulary is the vocabulary of hospitality.</w:t>
+      </w:r>
+    </w:p>
+    <w:p>
+      <w:pPr>
+        <w:pStyle w:val="Compact"/>
+        <w:numPr>
+          <w:ilvl w:val="0"/>
+          <w:numId w:val="1003"/>
+        </w:numPr>
+      </w:pPr>
+      <w:r>
+        <w:t xml:space="preserve">Designed the motivation to come from the walker rather than from streaks and mascots. People already dream of a specific walk, and every walk carries a language.</w:t>
+      </w:r>
+    </w:p>
+    <w:p>
+      <w:pPr>
+        <w:pStyle w:val="Compact"/>
+        <w:numPr>
+          <w:ilvl w:val="0"/>
+          <w:numId w:val="1003"/>
+        </w:numPr>
+      </w:pPr>
+      <w:r>
+        <w:t xml:space="preserve">Structured each stage across four levels, gated on proficiency, with click-to-hear audio on every word.</w:t>
+      </w:r>
+    </w:p>
+    <w:p>
+      <w:pPr>
+        <w:pStyle w:val="Compact"/>
+        <w:numPr>
+          <w:ilvl w:val="0"/>
+          <w:numId w:val="1003"/>
+        </w:numPr>
+      </w:pPr>
+      <w:r>
+        <w:t xml:space="preserve">Built a human curation gate: no image, recording, or encounter reaches a learner without review.</w:t>
+      </w:r>
+    </w:p>
+    <w:p>
+      <w:pPr>
+        <w:pStyle w:val="FirstParagraph"/>
+      </w:pPr>
+      <w:r>
+        <w:rPr>
+          <w:b/>
+          <w:bCs/>
+        </w:rPr>
+        <w:t xml:space="preserve">AI for Critical Infrastructure—Palaestra and Exedra (palaestra.thrivetech.ai)</w:t>
+      </w:r>
+    </w:p>
+    <w:p>
+      <w:pPr>
+        <w:pStyle w:val="Compact"/>
+        <w:numPr>
+          <w:ilvl w:val="0"/>
+          <w:numId w:val="1004"/>
+        </w:numPr>
+      </w:pPr>
+      <w:r>
+        <w:t xml:space="preserve">Built Palaestra to measure how best large data centers can flex their demand under grid stress, the open question in the IEEE data center work above.</w:t>
+      </w:r>
+    </w:p>
+    <w:p>
+      <w:pPr>
+        <w:pStyle w:val="Compact"/>
+        <w:numPr>
+          <w:ilvl w:val="0"/>
+          <w:numId w:val="1004"/>
+        </w:numPr>
+      </w:pPr>
+      <w:r>
+        <w:t xml:space="preserve">Designed a competition in which a player runs a data center at the grid interface for a simulated day, scored against a certified optimal line. Human or AI agent; both speak the same interface. Built five scenarios on public reliability testbeds.</w:t>
+      </w:r>
+    </w:p>
+    <w:p>
+      <w:pPr>
+        <w:pStyle w:val="Compact"/>
+        <w:numPr>
+          <w:ilvl w:val="0"/>
+          <w:numId w:val="1004"/>
+        </w:numPr>
+      </w:pPr>
+      <w:r>
+        <w:t xml:space="preserve">Published the scenario format, the competitor interface, and the complete engine rules as Exedra (</w:t>
+      </w:r>
+      <w:hyperlink r:id="rId16">
+        <w:r>
+          <w:rPr>
+            <w:rStyle w:val="Hyperlink"/>
+          </w:rPr>
+          <w:t xml:space="preserve">github.com/martymcenroe/Exedra</w:t>
+        </w:r>
+      </w:hyperlink>
+      <w:r>
+        <w:t xml:space="preserve">), so any group can build a scenario from its own region’s public grid records. Wrote a multi-lesson curriculum.</w:t>
+      </w:r>
+    </w:p>
+    <w:p>
+      <w:pPr>
+        <w:pStyle w:val="FirstParagraph"/>
+      </w:pPr>
+      <w:r>
+        <w:rPr>
+          <w:b/>
+          <w:bCs/>
+        </w:rPr>
+        <w:t xml:space="preserve">Consumer and Developer Products—Shipped Through Three Public Registries</w:t>
+      </w:r>
+    </w:p>
+    <w:p>
+      <w:pPr>
+        <w:pStyle w:val="Compact"/>
+        <w:numPr>
+          <w:ilvl w:val="0"/>
+          <w:numId w:val="1005"/>
+        </w:numPr>
+      </w:pPr>
+      <w:r>
+        <w:t xml:space="preserve">Shipped</w:t>
+      </w:r>
+      <w:r>
+        <w:t xml:space="preserve"> </w:t>
+      </w:r>
+      <w:r>
+        <w:rPr>
+          <w:b/>
+          <w:bCs/>
+        </w:rPr>
+        <w:t xml:space="preserve">Aletheia</w:t>
+      </w:r>
+      <w:r>
+        <w:t xml:space="preserve"> </w:t>
+      </w:r>
+      <w:r>
+        <w:t xml:space="preserve">to both the Chrome Web Store and Mozilla Add-ons: select any text on any page and get the etymology and historical context concealed inside it. Named for Heidegger’s term for unconcealment.</w:t>
+      </w:r>
+    </w:p>
+    <w:p>
+      <w:pPr>
+        <w:pStyle w:val="Compact"/>
+        <w:numPr>
+          <w:ilvl w:val="0"/>
+          <w:numId w:val="1005"/>
+        </w:numPr>
+      </w:pPr>
+      <w:r>
+        <w:t xml:space="preserve">Designed a model ladder the reader climbs on request. A cheap model makes the first pass. Each request for more depth moves the work up a tier, and the analysis unconceals at ever-greater depths of meaning and poetry.</w:t>
+      </w:r>
+    </w:p>
+    <w:p>
+      <w:pPr>
+        <w:pStyle w:val="Compact"/>
+        <w:numPr>
+          <w:ilvl w:val="0"/>
+          <w:numId w:val="1005"/>
+        </w:numPr>
+      </w:pPr>
+      <w:r>
+        <w:t xml:space="preserve">Screened every request through a defense funnel before any analysis runs: selection check, hashed denylist, then a semantic classifier. Tested against eight attack classes. Limited logging to operational metadata, never content.</w:t>
+      </w:r>
+    </w:p>
+    <w:p>
+      <w:pPr>
+        <w:pStyle w:val="Compact"/>
+        <w:numPr>
+          <w:ilvl w:val="0"/>
+          <w:numId w:val="1005"/>
+        </w:numPr>
+      </w:pPr>
+      <w:r>
+        <w:t xml:space="preserve">Built</w:t>
+      </w:r>
+      <w:r>
+        <w:t xml:space="preserve"> </w:t>
+      </w:r>
+      <w:r>
+        <w:rPr>
+          <w:b/>
+          <w:bCs/>
+        </w:rPr>
+        <w:t xml:space="preserve">Clio</w:t>
+      </w:r>
+      <w:r>
+        <w:t xml:space="preserve">, a Chrome Web Store extension that extracts conversations with language models into structured data.</w:t>
+      </w:r>
+    </w:p>
+    <w:p>
+      <w:pPr>
+        <w:pStyle w:val="Compact"/>
+        <w:numPr>
+          <w:ilvl w:val="0"/>
+          <w:numId w:val="1005"/>
+        </w:numPr>
+      </w:pPr>
+      <w:r>
+        <w:t xml:space="preserve">Published</w:t>
+      </w:r>
+      <w:r>
+        <w:t xml:space="preserve"> </w:t>
+      </w:r>
+      <w:r>
+        <w:rPr>
+          <w:b/>
+          <w:bCs/>
+        </w:rPr>
+        <w:t xml:space="preserve">Silphe</w:t>
+      </w:r>
+      <w:r>
+        <w:t xml:space="preserve"> </w:t>
+      </w:r>
+      <w:r>
+        <w:t xml:space="preserve">to the Python Package Index, a behavioral biometrics library that quantifies a visuomotor signature from pointer dynamics: acquisition under Fitts’s law, hold tremor, and tracking lag. Kept analysis on the device and shipped with no third-party runtime dependencies.</w:t>
+      </w:r>
+    </w:p>
+    <w:p>
+      <w:pPr>
+        <w:pStyle w:val="FirstParagraph"/>
+      </w:pPr>
+      <w:r>
+        <w:rPr>
+          <w:b/>
+          <w:bCs/>
+        </w:rPr>
+        <w:t xml:space="preserve">Agent Safety Research</w:t>
+      </w:r>
+    </w:p>
+    <w:p>
+      <w:pPr>
+        <w:pStyle w:val="Compact"/>
+        <w:numPr>
+          <w:ilvl w:val="0"/>
+          <w:numId w:val="1006"/>
+        </w:numPr>
+      </w:pPr>
+      <w:r>
+        <w:t xml:space="preserve">Filed two U.S. patents in 2026 on AI agent safety, as independent inventor and applicant.</w:t>
+      </w:r>
+    </w:p>
+    <w:p>
+      <w:pPr>
+        <w:pStyle w:val="Compact"/>
+        <w:numPr>
+          <w:ilvl w:val="0"/>
+          <w:numId w:val="1006"/>
+        </w:numPr>
+      </w:pPr>
+      <w:r>
+        <w:t xml:space="preserve">Mapped AI agent failure modes onto MITRE ATT&amp;CK insider-threat techniques. An agent pushed to finish a task behaves like an insider. Built a 42-probe audit tool across eight tactics and hardened a 50-repository fleet against what it found.</w:t>
+      </w:r>
+    </w:p>
+    <w:p>
+      <w:pPr>
+        <w:pStyle w:val="Compact"/>
+        <w:numPr>
+          <w:ilvl w:val="0"/>
+          <w:numId w:val="1006"/>
+        </w:numPr>
+      </w:pPr>
+      <w:r>
+        <w:t xml:space="preserve">Designed</w:t>
+      </w:r>
+      <w:r>
+        <w:t xml:space="preserve"> </w:t>
+      </w:r>
+      <w:r>
+        <w:rPr>
+          <w:b/>
+          <w:bCs/>
+        </w:rPr>
+        <w:t xml:space="preserve">sentinel-rfc</w:t>
+      </w:r>
+      <w:r>
+        <w:t xml:space="preserve">, an architecture giving agents their own permissions rather than inheriting the user’s. Built</w:t>
+      </w:r>
+      <w:r>
+        <w:t xml:space="preserve"> </w:t>
+      </w:r>
+      <w:r>
+        <w:rPr>
+          <w:b/>
+          <w:bCs/>
+        </w:rPr>
+        <w:t xml:space="preserve">Maieutics</w:t>
+      </w:r>
+      <w:r>
+        <w:t xml:space="preserve">, a method for proving human authorship of AI-assisted technical work, anchored in USPTO inventorship guidance.</w:t>
+      </w:r>
+    </w:p>
+    <w:bookmarkEnd w:id="17"/>
+    <w:bookmarkStart w:id="18" w:name="professional-experience"/>
+    <w:p>
+      <w:pPr>
+        <w:pStyle w:val="Heading2"/>
+      </w:pPr>
+      <w:r>
+        <w:t xml:space="preserve">Professional Experience</w:t>
+      </w:r>
+    </w:p>
+    <w:p>
+      <w:pPr>
+        <w:pStyle w:val="FirstParagraph"/>
+      </w:pPr>
+      <w:r>
+        <w:rPr>
+          <w:b/>
+          <w:bCs/>
+        </w:rPr>
+        <w:t xml:space="preserve">THRIVETECH.AI</w:t>
+      </w:r>
+      <w:r>
+        <w:t xml:space="preserve"> </w:t>
+      </w:r>
+      <w:r>
+        <w:t xml:space="preserve">– Plano, TX | June 2022–present</w:t>
       </w:r>
     </w:p>
     <w:p>
@@ -560,13 +684,7 @@
           <w:b/>
           <w:bCs/>
         </w:rPr>
-        <w:t xml:space="preserve">Section Author, IEEE PES PSCCC S17—Use of Software Bill of Materials (SBOM) in the Energy Sector</w:t>
-      </w:r>
-      <w:r>
-        <w:t xml:space="preserve"> </w:t>
-      </w:r>
-      <w:r>
-        <w:t xml:space="preserve">| 2025–present</w:t>
+        <w:t xml:space="preserve">Founder &amp; President</w:t>
       </w:r>
     </w:p>
     <w:p>
@@ -574,17 +692,399 @@
         <w:pStyle w:val="BodyText"/>
       </w:pPr>
       <w:r>
-        <w:t xml:space="preserve">Section: Use Cases in the EPS Industry. Six use-case analyses: procurement vs. maintenance vulnerability assessment, OSS licensing, country-of-origin and embargo risk, system-level SBOM, legacy devices, and SBOM scope beyond IEDs/RTUs. Citations span NIST SP 800-161 r1, NERC CIP-010/013, CISA/NSA/NTIA, NDAA §889, BIS Entity List, and peer-reviewed substation BoM literature.</w:t>
-      </w:r>
-    </w:p>
-    <w:bookmarkEnd w:id="16"/>
-    <w:bookmarkStart w:id="17" w:name="professional-experience"/>
+        <w:t xml:space="preserve">Independent AI architecture practice and consulting vehicle; holds the invention portfolio. Products and research are listed above under Applied AI Portfolio.</w:t>
+      </w:r>
+    </w:p>
+    <w:p>
+      <w:pPr>
+        <w:pStyle w:val="BodyText"/>
+      </w:pPr>
+      <w:r>
+        <w:rPr>
+          <w:b/>
+          <w:bCs/>
+        </w:rPr>
+        <w:t xml:space="preserve">TEXAS DEPARTMENT OF TRANSPORTATION</w:t>
+      </w:r>
+      <w:r>
+        <w:t xml:space="preserve"> </w:t>
+      </w:r>
+      <w:r>
+        <w:t xml:space="preserve">– Austin, TX | September 2023–April 2024</w:t>
+      </w:r>
+    </w:p>
+    <w:p>
+      <w:pPr>
+        <w:pStyle w:val="BodyText"/>
+      </w:pPr>
+      <w:r>
+        <w:rPr>
+          <w:b/>
+          <w:bCs/>
+        </w:rPr>
+        <w:t xml:space="preserve">AI Strategic Consultant</w:t>
+      </w:r>
+    </w:p>
+    <w:p>
+      <w:pPr>
+        <w:pStyle w:val="Compact"/>
+        <w:numPr>
+          <w:ilvl w:val="0"/>
+          <w:numId w:val="1007"/>
+        </w:numPr>
+      </w:pPr>
+      <w:r>
+        <w:t xml:space="preserve">Authored 76-page AI strategic plan encompassing 32 epics, 213 use cases, governance controls, risk assessments, and AI ethics framework for state-wide transportation agency.</w:t>
+      </w:r>
+    </w:p>
+    <w:p>
+      <w:pPr>
+        <w:pStyle w:val="Compact"/>
+        <w:numPr>
+          <w:ilvl w:val="0"/>
+          <w:numId w:val="1007"/>
+        </w:numPr>
+      </w:pPr>
+      <w:r>
+        <w:t xml:space="preserve">Conducted stakeholder interviews across every division and district; applied LDA topic modeling to surface themes and identify high-priority AI applications meeting federal and state regulatory requirements.</w:t>
+      </w:r>
+    </w:p>
+    <w:p>
+      <w:pPr>
+        <w:pStyle w:val="Compact"/>
+        <w:numPr>
+          <w:ilvl w:val="0"/>
+          <w:numId w:val="1007"/>
+        </w:numPr>
+      </w:pPr>
+      <w:r>
+        <w:t xml:space="preserve">Translated technical AI capabilities into business-value propositions for non-technical executives; established phased implementation roadmaps balancing feasibility, compliance, and organizational change.</w:t>
+      </w:r>
+    </w:p>
+    <w:p>
+      <w:pPr>
+        <w:pStyle w:val="FirstParagraph"/>
+      </w:pPr>
+      <w:r>
+        <w:rPr>
+          <w:b/>
+          <w:bCs/>
+        </w:rPr>
+        <w:t xml:space="preserve">AFINITI</w:t>
+      </w:r>
+      <w:r>
+        <w:t xml:space="preserve"> </w:t>
+      </w:r>
+      <w:r>
+        <w:t xml:space="preserve">– Washington, DC | March 2021–June 2022</w:t>
+      </w:r>
+    </w:p>
+    <w:p>
+      <w:pPr>
+        <w:pStyle w:val="BodyText"/>
+      </w:pPr>
+      <w:r>
+        <w:rPr>
+          <w:b/>
+          <w:bCs/>
+        </w:rPr>
+        <w:t xml:space="preserve">Vice President, Product</w:t>
+      </w:r>
+    </w:p>
+    <w:p>
+      <w:pPr>
+        <w:pStyle w:val="BodyText"/>
+      </w:pPr>
+      <w:r>
+        <w:t xml:space="preserve">Product and security leadership for AI-powered customer-agent pairing platform optimizing enterprise contact center operations through behavioral analytics and machine learning.</w:t>
+      </w:r>
+    </w:p>
+    <w:p>
+      <w:pPr>
+        <w:pStyle w:val="Compact"/>
+        <w:numPr>
+          <w:ilvl w:val="0"/>
+          <w:numId w:val="1008"/>
+        </w:numPr>
+      </w:pPr>
+      <w:r>
+        <w:t xml:space="preserve">Led security architecture initiatives on a ~1M-line, 10-year-old C/C++ codebase: SonarQube vulnerability remediation, penetration test remediation, architecture reviews, API security hardening.</w:t>
+      </w:r>
+    </w:p>
+    <w:p>
+      <w:pPr>
+        <w:pStyle w:val="Compact"/>
+        <w:numPr>
+          <w:ilvl w:val="0"/>
+          <w:numId w:val="1008"/>
+        </w:numPr>
+      </w:pPr>
+      <w:r>
+        <w:t xml:space="preserve">Defined cross-functional product development processes spanning engineering, AI research, MLOps, and go-to-market. Hands-on DevOps across GCP and Azure (Docker, Jira, CI/CD).</w:t>
+      </w:r>
+    </w:p>
+    <w:p>
+      <w:pPr>
+        <w:pStyle w:val="Compact"/>
+        <w:numPr>
+          <w:ilvl w:val="0"/>
+          <w:numId w:val="1008"/>
+        </w:numPr>
+      </w:pPr>
+      <w:r>
+        <w:t xml:space="preserve">Set product strategy and prioritization across quarterly and sprint planning cycles, balancing ML algorithm investment against operational improvements and production issues.</w:t>
+      </w:r>
+    </w:p>
+    <w:p>
+      <w:pPr>
+        <w:pStyle w:val="FirstParagraph"/>
+      </w:pPr>
+      <w:r>
+        <w:rPr>
+          <w:b/>
+          <w:bCs/>
+        </w:rPr>
+        <w:t xml:space="preserve">AT&amp;T</w:t>
+      </w:r>
+      <w:r>
+        <w:t xml:space="preserve"> </w:t>
+      </w:r>
+      <w:r>
+        <w:t xml:space="preserve">– Plano, TX | September 1991–October 2020</w:t>
+      </w:r>
+    </w:p>
+    <w:p>
+      <w:pPr>
+        <w:pStyle w:val="BodyText"/>
+      </w:pPr>
+      <w:r>
+        <w:rPr>
+          <w:b/>
+          <w:bCs/>
+        </w:rPr>
+        <w:t xml:space="preserve">Director, Data Science &amp; Artificial Intelligence</w:t>
+      </w:r>
+      <w:r>
+        <w:t xml:space="preserve"> </w:t>
+      </w:r>
+      <w:r>
+        <w:t xml:space="preserve">| September 2017–October 2020</w:t>
+      </w:r>
+    </w:p>
+    <w:p>
+      <w:pPr>
+        <w:pStyle w:val="BodyText"/>
+      </w:pPr>
+      <w:r>
+        <w:t xml:space="preserve">Hands-on architect and individual contributor leading enterprise-scale AI/ML solutions. Led 45-person cross-functional team, $9M annual labor budget, $10M+ recurring annual savings, $20M+ in initiative funding secured through SVP-level partnerships.</w:t>
+      </w:r>
+    </w:p>
+    <w:p>
+      <w:pPr>
+        <w:pStyle w:val="Compact"/>
+        <w:numPr>
+          <w:ilvl w:val="0"/>
+          <w:numId w:val="1009"/>
+        </w:numPr>
+      </w:pPr>
+      <w:r>
+        <w:t xml:space="preserve">Built</w:t>
+      </w:r>
+      <w:r>
+        <w:t xml:space="preserve"> </w:t>
+      </w:r>
+      <w:r>
+        <w:rPr>
+          <w:b/>
+          <w:bCs/>
+        </w:rPr>
+        <w:t xml:space="preserve">TAVI</w:t>
+      </w:r>
+      <w:r>
+        <w:t xml:space="preserve">, an NLP customer-service chatbot handling 10,000+ daily interactions at 92% accuracy. Cut costs $4.5M in 15 months and improved first-call resolution 30%. Python, TensorFlow, BERT, AWS Lambda, DynamoDB.</w:t>
+      </w:r>
+    </w:p>
+    <w:p>
+      <w:pPr>
+        <w:pStyle w:val="Compact"/>
+        <w:numPr>
+          <w:ilvl w:val="0"/>
+          <w:numId w:val="1009"/>
+        </w:numPr>
+      </w:pPr>
+      <w:r>
+        <w:t xml:space="preserve">Delivered</w:t>
+      </w:r>
+      <w:r>
+        <w:t xml:space="preserve"> </w:t>
+      </w:r>
+      <w:r>
+        <w:rPr>
+          <w:b/>
+          <w:bCs/>
+        </w:rPr>
+        <w:t xml:space="preserve">SNAP</w:t>
+      </w:r>
+      <w:r>
+        <w:t xml:space="preserve">, computer vision for field operations and the first cloud-native AI solution at AT&amp;T enterprise scale. Saved $5.8M annually and raised field productivity 30%. Python, Azure Computer Vision, Core ML.</w:t>
+      </w:r>
+    </w:p>
+    <w:p>
+      <w:pPr>
+        <w:pStyle w:val="Compact"/>
+        <w:numPr>
+          <w:ilvl w:val="0"/>
+          <w:numId w:val="1009"/>
+        </w:numPr>
+      </w:pPr>
+      <w:r>
+        <w:t xml:space="preserve">Architected</w:t>
+      </w:r>
+      <w:r>
+        <w:t xml:space="preserve"> </w:t>
+      </w:r>
+      <w:r>
+        <w:rPr>
+          <w:b/>
+          <w:bCs/>
+        </w:rPr>
+        <w:t xml:space="preserve">EasyBake</w:t>
+      </w:r>
+      <w:r>
+        <w:t xml:space="preserve">, a no-code chatbot platform on Azure with API and robotic-process-automation overlays into dozens of enterprise systems. Won three internal production customers.</w:t>
+      </w:r>
+    </w:p>
+    <w:p>
+      <w:pPr>
+        <w:pStyle w:val="Compact"/>
+        <w:numPr>
+          <w:ilvl w:val="0"/>
+          <w:numId w:val="1009"/>
+        </w:numPr>
+      </w:pPr>
+      <w:r>
+        <w:t xml:space="preserve">Designed</w:t>
+      </w:r>
+      <w:r>
+        <w:t xml:space="preserve"> </w:t>
+      </w:r>
+      <w:r>
+        <w:rPr>
+          <w:b/>
+          <w:bCs/>
+        </w:rPr>
+        <w:t xml:space="preserve">Label Quest</w:t>
+      </w:r>
+      <w:r>
+        <w:t xml:space="preserve">, a gamified human-in-the-loop labeling system adopted by dozens of internal data science teams, covering text, image, and video with live leaderboards, accuracy tracking, and consensus quality gates.</w:t>
+      </w:r>
+    </w:p>
+    <w:p>
+      <w:pPr>
+        <w:pStyle w:val="Compact"/>
+        <w:numPr>
+          <w:ilvl w:val="0"/>
+          <w:numId w:val="1009"/>
+        </w:numPr>
+      </w:pPr>
+      <w:r>
+        <w:t xml:space="preserve">Delivered 90+ proof-of-concept solutions over three years; security protocols, audits, and vulnerability remediation for all AI deployments.</w:t>
+      </w:r>
+    </w:p>
+    <w:p>
+      <w:pPr>
+        <w:pStyle w:val="FirstParagraph"/>
+      </w:pPr>
+      <w:r>
+        <w:rPr>
+          <w:b/>
+          <w:bCs/>
+        </w:rPr>
+        <w:t xml:space="preserve">Lead Member Technical Staff, Enterprise Architect</w:t>
+      </w:r>
+      <w:r>
+        <w:t xml:space="preserve"> </w:t>
+      </w:r>
+      <w:r>
+        <w:t xml:space="preserve">| May 2013–August 2017</w:t>
+      </w:r>
+    </w:p>
+    <w:p>
+      <w:pPr>
+        <w:pStyle w:val="Compact"/>
+        <w:numPr>
+          <w:ilvl w:val="0"/>
+          <w:numId w:val="1010"/>
+        </w:numPr>
+      </w:pPr>
+      <w:r>
+        <w:t xml:space="preserve">Founded and chaired the enterprise AI &amp; Data Science Architecture Review Board, establishing the governance gates AI systems passed through across business units of a Fortune 10 company. Evaluated frameworks, vendors, and architectures for security, interoperability, licensing, and cost. Drove Python and R to enterprise-approved status.</w:t>
+      </w:r>
+    </w:p>
+    <w:p>
+      <w:pPr>
+        <w:pStyle w:val="Compact"/>
+        <w:numPr>
+          <w:ilvl w:val="0"/>
+          <w:numId w:val="1010"/>
+        </w:numPr>
+      </w:pPr>
+      <w:r>
+        <w:t xml:space="preserve">Deployed and administered Stack Overflow Enterprise to 31,000 users, clearing Technical Architecture Board approval, security review, and privacy compliance.</w:t>
+      </w:r>
+    </w:p>
+    <w:p>
+      <w:pPr>
+        <w:pStyle w:val="Compact"/>
+        <w:numPr>
+          <w:ilvl w:val="0"/>
+          <w:numId w:val="1010"/>
+        </w:numPr>
+      </w:pPr>
+      <w:r>
+        <w:t xml:space="preserve">Managed ‘RCloud’, the internal data science platform, and led training on Python, R, APIs, and AI architectures.</w:t>
+      </w:r>
+    </w:p>
+    <w:p>
+      <w:pPr>
+        <w:pStyle w:val="Compact"/>
+        <w:numPr>
+          <w:ilvl w:val="0"/>
+          <w:numId w:val="1010"/>
+        </w:numPr>
+      </w:pPr>
+      <w:r>
+        <w:t xml:space="preserve">Led tech evaluations setting enterprise direction: R vs SAS, MicroStrategy vs Tableau, GitHub vs Atlassian, AWS vs Azure vs GCP.</w:t>
+      </w:r>
+    </w:p>
+    <w:p>
+      <w:pPr>
+        <w:pStyle w:val="FirstParagraph"/>
+      </w:pPr>
+      <w:r>
+        <w:rPr>
+          <w:b/>
+          <w:bCs/>
+        </w:rPr>
+        <w:t xml:space="preserve">Additional Roles (1991–2013)</w:t>
+      </w:r>
+    </w:p>
+    <w:p>
+      <w:pPr>
+        <w:pStyle w:val="BodyText"/>
+      </w:pPr>
+      <w:r>
+        <w:t xml:space="preserve">AT&amp;T Bell Labs R&amp;D (Holmdel, NJ; 1991–1995) • Director of Program Management, IP Backbone • Director of Emerging Video Services, Corporate Strategy • Network Operations &amp; Engineering • Wireless communications development (multiple patents) • Resolved year-long migration crisis with 100-fold efficiency improvement in 45 days • Secured SVP funding for AI initiatives.</w:t>
+      </w:r>
+    </w:p>
+    <w:bookmarkEnd w:id="18"/>
+    <w:bookmarkStart w:id="19" w:name="licensure"/>
     <w:p>
       <w:pPr>
         <w:pStyle w:val="Heading2"/>
       </w:pPr>
       <w:r>
-        <w:t xml:space="preserve">Professional Experience</w:t>
+        <w:t xml:space="preserve">Licensure</w:t>
       </w:r>
     </w:p>
     <w:p>
@@ -596,13 +1096,28 @@
           <w:b/>
           <w:bCs/>
         </w:rPr>
-        <w:t xml:space="preserve">THRIVETECH.AI</w:t>
-      </w:r>
-      <w:r>
-        <w:t xml:space="preserve"> </w:t>
-      </w:r>
-      <w:r>
-        <w:t xml:space="preserve">– Plano, TX | June 2022–present</w:t>
+        <w:t xml:space="preserve">Licensed Professional Engineer</w:t>
+      </w:r>
+      <w:r>
+        <w:t xml:space="preserve">—State of Texas</w:t>
+      </w:r>
+    </w:p>
+    <w:bookmarkEnd w:id="19"/>
+    <w:bookmarkStart w:id="20" w:name="certifications"/>
+    <w:p>
+      <w:pPr>
+        <w:pStyle w:val="Heading2"/>
+      </w:pPr>
+      <w:r>
+        <w:t xml:space="preserve">Certifications</w:t>
+      </w:r>
+    </w:p>
+    <w:p>
+      <w:pPr>
+        <w:pStyle w:val="FirstParagraph"/>
+      </w:pPr>
+      <w:r>
+        <w:t xml:space="preserve">AWS—7 Certifications including:</w:t>
       </w:r>
     </w:p>
     <w:p>
@@ -610,11 +1125,7 @@
         <w:pStyle w:val="BodyText"/>
       </w:pPr>
       <w:r>
-        <w:rPr>
-          <w:b/>
-          <w:bCs/>
-        </w:rPr>
-        <w:t xml:space="preserve">Founder &amp; President</w:t>
+        <w:t xml:space="preserve">Machine Learning–Specialty</w:t>
       </w:r>
     </w:p>
     <w:p>
@@ -622,78 +1133,7 @@
         <w:pStyle w:val="BodyText"/>
       </w:pPr>
       <w:r>
-        <w:t xml:space="preserve">Independent AI architecture practice and C2C consulting vehicle; holds the independent invention portfolio. Active products:</w:t>
-      </w:r>
-      <w:r>
-        <w:t xml:space="preserve"> </w:t>
-      </w:r>
-      <w:r>
-        <w:rPr>
-          <w:b/>
-          <w:bCs/>
-        </w:rPr>
-        <w:t xml:space="preserve">AssemblyZero</w:t>
-      </w:r>
-      <w:r>
-        <w:t xml:space="preserve">,</w:t>
-      </w:r>
-      <w:r>
-        <w:t xml:space="preserve"> </w:t>
-      </w:r>
-      <w:r>
-        <w:rPr>
-          <w:b/>
-          <w:bCs/>
-        </w:rPr>
-        <w:t xml:space="preserve">Hermes</w:t>
-      </w:r>
-      <w:r>
-        <w:t xml:space="preserve">,</w:t>
-      </w:r>
-      <w:r>
-        <w:t xml:space="preserve"> </w:t>
-      </w:r>
-      <w:r>
-        <w:rPr>
-          <w:b/>
-          <w:bCs/>
-        </w:rPr>
-        <w:t xml:space="preserve">Aletheia</w:t>
-      </w:r>
-      <w:r>
-        <w:t xml:space="preserve">,</w:t>
-      </w:r>
-      <w:r>
-        <w:t xml:space="preserve"> </w:t>
-      </w:r>
-      <w:r>
-        <w:rPr>
-          <w:b/>
-          <w:bCs/>
-        </w:rPr>
-        <w:t xml:space="preserve">Chiron</w:t>
-      </w:r>
-      <w:r>
-        <w:t xml:space="preserve"> </w:t>
-      </w:r>
-      <w:r>
-        <w:t xml:space="preserve">(AI governance study SaaS for IAPP AIGP preparation), and</w:t>
-      </w:r>
-      <w:r>
-        <w:t xml:space="preserve"> </w:t>
-      </w:r>
-      <w:r>
-        <w:rPr>
-          <w:b/>
-          <w:bCs/>
-        </w:rPr>
-        <w:t xml:space="preserve">Clio</w:t>
-      </w:r>
-      <w:r>
-        <w:t xml:space="preserve"> </w:t>
-      </w:r>
-      <w:r>
-        <w:t xml:space="preserve">(Chrome extension for extracting LLM conversations to structured JSON).</w:t>
+        <w:t xml:space="preserve">Solutions Architect–Professional</w:t>
       </w:r>
     </w:p>
     <w:p>
@@ -701,17 +1141,7 @@
         <w:pStyle w:val="BodyText"/>
       </w:pPr>
       <w:r>
-        <w:rPr>
-          <w:b/>
-          <w:bCs/>
-        </w:rPr>
-        <w:t xml:space="preserve">TEXAS DEPARTMENT OF TRANSPORTATION</w:t>
-      </w:r>
-      <w:r>
-        <w:t xml:space="preserve"> </w:t>
-      </w:r>
-      <w:r>
-        <w:t xml:space="preserve">– Austin, TX | September 2023–April 2024</w:t>
+        <w:t xml:space="preserve">Data Analytics–Specialty</w:t>
       </w:r>
     </w:p>
     <w:p>
@@ -719,47 +1149,131 @@
         <w:pStyle w:val="BodyText"/>
       </w:pPr>
       <w:r>
-        <w:rPr>
-          <w:b/>
-          <w:bCs/>
-        </w:rPr>
-        <w:t xml:space="preserve">AI Strategic Consultant</w:t>
-      </w:r>
-    </w:p>
-    <w:p>
-      <w:pPr>
-        <w:pStyle w:val="Compact"/>
-        <w:numPr>
-          <w:ilvl w:val="0"/>
-          <w:numId w:val="1007"/>
-        </w:numPr>
-      </w:pPr>
-      <w:r>
-        <w:t xml:space="preserve">Authored 76-page AI strategic plan encompassing 32 epics, 213 use cases, governance controls, risk assessments, and AI ethics framework for state-wide transportation agency.</w:t>
-      </w:r>
-    </w:p>
-    <w:p>
-      <w:pPr>
-        <w:pStyle w:val="Compact"/>
-        <w:numPr>
-          <w:ilvl w:val="0"/>
-          <w:numId w:val="1007"/>
-        </w:numPr>
-      </w:pPr>
-      <w:r>
-        <w:t xml:space="preserve">Conducted stakeholder interviews across every division and district; applied LDA topic modeling to surface themes and identify high-priority AI applications meeting federal and state regulatory requirements.</w:t>
-      </w:r>
-    </w:p>
-    <w:p>
-      <w:pPr>
-        <w:pStyle w:val="Compact"/>
-        <w:numPr>
-          <w:ilvl w:val="0"/>
-          <w:numId w:val="1007"/>
-        </w:numPr>
-      </w:pPr>
-      <w:r>
-        <w:t xml:space="preserve">Translated technical AI capabilities into business-value propositions for non-technical executives; established phased implementation roadmaps balancing feasibility, compliance, and organizational change.</w:t>
+        <w:t xml:space="preserve">Data Engineer Associate</w:t>
+      </w:r>
+    </w:p>
+    <w:p>
+      <w:pPr>
+        <w:pStyle w:val="BodyText"/>
+      </w:pPr>
+      <w:r>
+        <w:t xml:space="preserve">Microsoft Azure:</w:t>
+      </w:r>
+    </w:p>
+    <w:p>
+      <w:pPr>
+        <w:pStyle w:val="BodyText"/>
+      </w:pPr>
+      <w:r>
+        <w:t xml:space="preserve">DevOps Engineer Expert</w:t>
+      </w:r>
+    </w:p>
+    <w:p>
+      <w:pPr>
+        <w:pStyle w:val="BodyText"/>
+      </w:pPr>
+      <w:r>
+        <w:t xml:space="preserve">AI Fundamentals</w:t>
+      </w:r>
+    </w:p>
+    <w:p>
+      <w:pPr>
+        <w:pStyle w:val="BodyText"/>
+      </w:pPr>
+      <w:r>
+        <w:t xml:space="preserve">Security, Compliance &amp; Identity Fundamentals</w:t>
+      </w:r>
+    </w:p>
+    <w:p>
+      <w:pPr>
+        <w:pStyle w:val="BodyText"/>
+      </w:pPr>
+      <w:r>
+        <w:rPr>
+          <w:b/>
+          <w:bCs/>
+        </w:rPr>
+        <w:t xml:space="preserve">CISSP</w:t>
+      </w:r>
+      <w:r>
+        <w:t xml:space="preserve"> </w:t>
+      </w:r>
+      <w:r>
+        <w:t xml:space="preserve">&amp;</w:t>
+      </w:r>
+      <w:r>
+        <w:t xml:space="preserve"> </w:t>
+      </w:r>
+      <w:r>
+        <w:rPr>
+          <w:b/>
+          <w:bCs/>
+        </w:rPr>
+        <w:t xml:space="preserve">CCSP</w:t>
+      </w:r>
+      <w:r>
+        <w:t xml:space="preserve">—ISC2</w:t>
+      </w:r>
+      <w:r>
+        <w:t xml:space="preserve"> </w:t>
+      </w:r>
+      <w:r>
+        <w:t xml:space="preserve">|</w:t>
+      </w:r>
+      <w:r>
+        <w:t xml:space="preserve"> </w:t>
+      </w:r>
+      <w:r>
+        <w:rPr>
+          <w:b/>
+          <w:bCs/>
+        </w:rPr>
+        <w:t xml:space="preserve">PMP</w:t>
+      </w:r>
+      <w:r>
+        <w:t xml:space="preserve"> </w:t>
+      </w:r>
+      <w:r>
+        <w:t xml:space="preserve">&amp;</w:t>
+      </w:r>
+      <w:r>
+        <w:t xml:space="preserve"> </w:t>
+      </w:r>
+      <w:r>
+        <w:rPr>
+          <w:b/>
+          <w:bCs/>
+        </w:rPr>
+        <w:t xml:space="preserve">PgMP</w:t>
+      </w:r>
+      <w:r>
+        <w:t xml:space="preserve">—PMI</w:t>
+      </w:r>
+      <w:r>
+        <w:t xml:space="preserve"> </w:t>
+      </w:r>
+      <w:r>
+        <w:t xml:space="preserve">|</w:t>
+      </w:r>
+      <w:r>
+        <w:t xml:space="preserve"> </w:t>
+      </w:r>
+      <w:r>
+        <w:rPr>
+          <w:b/>
+          <w:bCs/>
+        </w:rPr>
+        <w:t xml:space="preserve">Wireless Communications Professional (WCP)</w:t>
+      </w:r>
+    </w:p>
+    <w:bookmarkEnd w:id="20"/>
+    <w:bookmarkStart w:id="21" w:name="education"/>
+    <w:p>
+      <w:pPr>
+        <w:pStyle w:val="Heading2"/>
+      </w:pPr>
+      <w:r>
+        <w:t xml:space="preserve">Education</w:t>
       </w:r>
     </w:p>
     <w:p>
@@ -767,17 +1281,10 @@
         <w:pStyle w:val="FirstParagraph"/>
       </w:pPr>
       <w:r>
-        <w:rPr>
-          <w:b/>
-          <w:bCs/>
-        </w:rPr>
-        <w:t xml:space="preserve">AFINITI</w:t>
-      </w:r>
-      <w:r>
-        <w:t xml:space="preserve"> </w:t>
-      </w:r>
-      <w:r>
-        <w:t xml:space="preserve">– Washington, DC | March 2021–June 2022</w:t>
+        <w:t xml:space="preserve">Master of Computer Science</w:t>
+      </w:r>
+      <w:r>
+        <w:t xml:space="preserve">, University of Illinois Urbana-Champaign (2017)</w:t>
       </w:r>
     </w:p>
     <w:p>
@@ -785,11 +1292,10 @@
         <w:pStyle w:val="BodyText"/>
       </w:pPr>
       <w:r>
-        <w:rPr>
-          <w:b/>
-          <w:bCs/>
-        </w:rPr>
-        <w:t xml:space="preserve">Vice President, Product</w:t>
+        <w:t xml:space="preserve">Master of Science, Electrical Engineering</w:t>
+      </w:r>
+      <w:r>
+        <w:t xml:space="preserve">, University of Maryland, College Park</w:t>
       </w:r>
     </w:p>
     <w:p>
@@ -797,43 +1303,20 @@
         <w:pStyle w:val="BodyText"/>
       </w:pPr>
       <w:r>
-        <w:t xml:space="preserve">Product and security leadership for AI-powered customer-agent pairing platform optimizing enterprise contact center operations through behavioral analytics and machine learning.</w:t>
-      </w:r>
-    </w:p>
-    <w:p>
-      <w:pPr>
-        <w:pStyle w:val="Compact"/>
-        <w:numPr>
-          <w:ilvl w:val="0"/>
-          <w:numId w:val="1008"/>
-        </w:numPr>
-      </w:pPr>
-      <w:r>
-        <w:t xml:space="preserve">Led security architecture initiatives on a ~1M-line, 10-year-old C/C++ codebase: SonarQube vulnerability remediation, penetration test remediation, architecture reviews, API security hardening.</w:t>
-      </w:r>
-    </w:p>
-    <w:p>
-      <w:pPr>
-        <w:pStyle w:val="Compact"/>
-        <w:numPr>
-          <w:ilvl w:val="0"/>
-          <w:numId w:val="1008"/>
-        </w:numPr>
-      </w:pPr>
-      <w:r>
-        <w:t xml:space="preserve">Defined cross-functional product development processes spanning engineering, AI research, MLOps, and go-to-market. Hands-on DevOps across GCP and Azure (Docker, Jira, CI/CD).</w:t>
-      </w:r>
-    </w:p>
-    <w:p>
-      <w:pPr>
-        <w:pStyle w:val="Compact"/>
-        <w:numPr>
-          <w:ilvl w:val="0"/>
-          <w:numId w:val="1008"/>
-        </w:numPr>
-      </w:pPr>
-      <w:r>
-        <w:t xml:space="preserve">Set product strategy and prioritization across quarterly and sprint planning cycles, balancing ML algorithm investment against operational improvements and production issues.</w:t>
+        <w:t xml:space="preserve">Bachelor of Science, Electrical Engineering</w:t>
+      </w:r>
+      <w:r>
+        <w:t xml:space="preserve">, University of Maryland, College Park</w:t>
+      </w:r>
+    </w:p>
+    <w:bookmarkEnd w:id="21"/>
+    <w:bookmarkStart w:id="22" w:name="professional-memberships"/>
+    <w:p>
+      <w:pPr>
+        <w:pStyle w:val="Heading2"/>
+      </w:pPr>
+      <w:r>
+        <w:t xml:space="preserve">Professional Memberships</w:t>
       </w:r>
     </w:p>
     <w:p>
@@ -841,131 +1324,41 @@
         <w:pStyle w:val="FirstParagraph"/>
       </w:pPr>
       <w:r>
-        <w:rPr>
-          <w:b/>
-          <w:bCs/>
-        </w:rPr>
-        <w:t xml:space="preserve">AT&amp;T</w:t>
-      </w:r>
-      <w:r>
-        <w:t xml:space="preserve"> </w:t>
-      </w:r>
-      <w:r>
-        <w:t xml:space="preserve">– Plano, TX | September 1991–October 2020</w:t>
-      </w:r>
-    </w:p>
-    <w:p>
-      <w:pPr>
-        <w:pStyle w:val="BodyText"/>
-      </w:pPr>
-      <w:r>
-        <w:rPr>
-          <w:b/>
-          <w:bCs/>
-        </w:rPr>
-        <w:t xml:space="preserve">Director, Data Science &amp; Artificial Intelligence</w:t>
-      </w:r>
-      <w:r>
-        <w:t xml:space="preserve"> </w:t>
-      </w:r>
-      <w:r>
-        <w:t xml:space="preserve">| September 2017–October 2020</w:t>
-      </w:r>
-    </w:p>
-    <w:p>
-      <w:pPr>
-        <w:pStyle w:val="BodyText"/>
-      </w:pPr>
-      <w:r>
-        <w:t xml:space="preserve">Hands-on architect and individual contributor leading enterprise-scale AI/ML solutions. Led 45-person cross-functional team, $9M annual labor budget, $10M+ recurring annual savings, $20M+ in initiative funding secured through SVP-level partnerships.</w:t>
-      </w:r>
-    </w:p>
-    <w:p>
-      <w:pPr>
-        <w:pStyle w:val="Compact"/>
-        <w:numPr>
-          <w:ilvl w:val="0"/>
-          <w:numId w:val="1009"/>
-        </w:numPr>
-      </w:pPr>
-      <w:r>
-        <w:rPr>
-          <w:b/>
-          <w:bCs/>
-        </w:rPr>
-        <w:t xml:space="preserve">TAVI</w:t>
-      </w:r>
-      <w:r>
-        <w:t xml:space="preserve">—NLP customer-service chatbot (Python, TensorFlow, BERT, AWS Lambda, DynamoDB). 10,000+ daily interactions at 92% accuracy. Reduced costs $4.5M in 15 months; 30% first-call resolution improvement.</w:t>
-      </w:r>
-    </w:p>
-    <w:p>
-      <w:pPr>
-        <w:pStyle w:val="Compact"/>
-        <w:numPr>
-          <w:ilvl w:val="0"/>
-          <w:numId w:val="1009"/>
-        </w:numPr>
-      </w:pPr>
-      <w:r>
-        <w:rPr>
-          <w:b/>
-          <w:bCs/>
-        </w:rPr>
-        <w:t xml:space="preserve">SNAP</w:t>
-      </w:r>
-      <w:r>
-        <w:t xml:space="preserve">—computer vision for field operations (Python, Azure CV, Core ML, Azure DevOps). First cloud-native AI solution at AT&amp;T enterprise scale. $5.8M annual savings; 30% field productivity improvement.</w:t>
-      </w:r>
-    </w:p>
-    <w:p>
-      <w:pPr>
-        <w:pStyle w:val="Compact"/>
-        <w:numPr>
-          <w:ilvl w:val="0"/>
-          <w:numId w:val="1009"/>
-        </w:numPr>
-      </w:pPr>
-      <w:r>
-        <w:rPr>
-          <w:b/>
-          <w:bCs/>
-        </w:rPr>
-        <w:t xml:space="preserve">EasyBake</w:t>
-      </w:r>
-      <w:r>
-        <w:t xml:space="preserve">—no-code chatbot platform on Azure with API and RPA overlays to dozens of AT&amp;T enterprise systems. Three internal production customers. Pre-LLM conversational AI architecture.</w:t>
-      </w:r>
-    </w:p>
-    <w:p>
-      <w:pPr>
-        <w:pStyle w:val="Compact"/>
-        <w:numPr>
-          <w:ilvl w:val="0"/>
-          <w:numId w:val="1009"/>
-        </w:numPr>
-      </w:pPr>
-      <w:r>
-        <w:rPr>
-          <w:b/>
-          <w:bCs/>
-        </w:rPr>
-        <w:t xml:space="preserve">Label Quest</w:t>
-      </w:r>
-      <w:r>
-        <w:t xml:space="preserve">—gamified human-in-the-loop labeling system used by dozens of internal data science teams, supporting text, image, and video labeling with real-time leaderboards, accuracy tracking, and consensus quality gates.</w:t>
-      </w:r>
-    </w:p>
-    <w:p>
-      <w:pPr>
-        <w:pStyle w:val="Compact"/>
-        <w:numPr>
-          <w:ilvl w:val="0"/>
-          <w:numId w:val="1009"/>
-        </w:numPr>
-      </w:pPr>
-      <w:r>
-        <w:t xml:space="preserve">Delivered 90+ proof-of-concept solutions over three years; security protocols, audits, and vulnerability remediation for all AI deployments.</w:t>
+        <w:t xml:space="preserve">IEEE Senior Member •</w:t>
+      </w:r>
+      <w:r>
+        <w:t xml:space="preserve"> </w:t>
+      </w:r>
+      <w:r>
+        <w:t xml:space="preserve">International Association of Privacy Professionals (IAPP) •</w:t>
+      </w:r>
+      <w:r>
+        <w:t xml:space="preserve"> </w:t>
+      </w:r>
+      <w:r>
+        <w:t xml:space="preserve">ISC2 •</w:t>
+      </w:r>
+      <w:r>
+        <w:t xml:space="preserve"> </w:t>
+      </w:r>
+      <w:r>
+        <w:t xml:space="preserve">Project Management Institute (PMI) •</w:t>
+      </w:r>
+      <w:r>
+        <w:t xml:space="preserve"> </w:t>
+      </w:r>
+      <w:r>
+        <w:t xml:space="preserve">Open Worldwide Application Security Project (OWASP)</w:t>
+      </w:r>
+    </w:p>
+    <w:bookmarkEnd w:id="22"/>
+    <w:bookmarkStart w:id="23" w:name="patents"/>
+    <w:p>
+      <w:pPr>
+        <w:pStyle w:val="Heading2"/>
+      </w:pPr>
+      <w:r>
+        <w:t xml:space="preserve">Patents</w:t>
       </w:r>
     </w:p>
     <w:p>
@@ -977,409 +1370,16 @@
           <w:b/>
           <w:bCs/>
         </w:rPr>
-        <w:t xml:space="preserve">Lead Member Technical Staff, Enterprise Architect</w:t>
-      </w:r>
-      <w:r>
-        <w:t xml:space="preserve"> </w:t>
-      </w:r>
-      <w:r>
-        <w:t xml:space="preserve">| May 2013–August 2017</w:t>
-      </w:r>
-    </w:p>
-    <w:p>
-      <w:pPr>
-        <w:pStyle w:val="Compact"/>
-        <w:numPr>
-          <w:ilvl w:val="0"/>
-          <w:numId w:val="1010"/>
-        </w:numPr>
-      </w:pPr>
-      <w:r>
-        <w:t xml:space="preserve">Founding chair of the AI &amp; Data Science Architecture Review Board (described in Section above).</w:t>
-      </w:r>
-    </w:p>
-    <w:p>
-      <w:pPr>
-        <w:pStyle w:val="Compact"/>
-        <w:numPr>
-          <w:ilvl w:val="0"/>
-          <w:numId w:val="1010"/>
-        </w:numPr>
-      </w:pPr>
-      <w:r>
-        <w:t xml:space="preserve">Product manager for ‘RCloud’ internal data science platform; led training on Python, R, APIs, and AI architectures.</w:t>
-      </w:r>
-    </w:p>
-    <w:p>
-      <w:pPr>
-        <w:pStyle w:val="Compact"/>
-        <w:numPr>
-          <w:ilvl w:val="0"/>
-          <w:numId w:val="1010"/>
-        </w:numPr>
-      </w:pPr>
-      <w:r>
-        <w:t xml:space="preserve">Led tech evaluations setting enterprise direction: R vs SAS, MicroStrategy vs Tableau, GitHub vs Atlassian, AWS vs Azure vs GCP.</w:t>
-      </w:r>
-    </w:p>
-    <w:p>
-      <w:pPr>
-        <w:pStyle w:val="FirstParagraph"/>
-      </w:pPr>
-      <w:r>
-        <w:rPr>
-          <w:b/>
-          <w:bCs/>
-        </w:rPr>
-        <w:t xml:space="preserve">Additional Roles (1991–2013)</w:t>
-      </w:r>
-    </w:p>
-    <w:p>
-      <w:pPr>
-        <w:pStyle w:val="BodyText"/>
-      </w:pPr>
-      <w:r>
-        <w:t xml:space="preserve">AT&amp;T Bell Labs R&amp;D (Holmdel, NJ; 1991–1995) • Director of Program Management, IP Backbone • Director of Emerging Video Services, Corporate Strategy • Network Operations &amp; Engineering • Wireless communications development (multiple patents) • Resolved year-long migration crisis with 100-fold efficiency improvement in 45 days • Secured SVP funding for AI initiatives.</w:t>
-      </w:r>
-    </w:p>
-    <w:bookmarkEnd w:id="17"/>
-    <w:bookmarkStart w:id="18" w:name="licensure"/>
-    <w:p>
-      <w:pPr>
-        <w:pStyle w:val="Heading2"/>
-      </w:pPr>
-      <w:r>
-        <w:t xml:space="preserve">Licensure</w:t>
-      </w:r>
-    </w:p>
-    <w:p>
-      <w:pPr>
-        <w:pStyle w:val="FirstParagraph"/>
-      </w:pPr>
-      <w:r>
-        <w:rPr>
-          <w:b/>
-          <w:bCs/>
-        </w:rPr>
-        <w:t xml:space="preserve">Licensed Professional Engineer</w:t>
-      </w:r>
-      <w:r>
-        <w:t xml:space="preserve">—State of Texas</w:t>
-      </w:r>
-    </w:p>
-    <w:bookmarkEnd w:id="18"/>
-    <w:bookmarkStart w:id="19" w:name="certifications"/>
-    <w:p>
-      <w:pPr>
-        <w:pStyle w:val="Heading2"/>
-      </w:pPr>
-      <w:r>
-        <w:t xml:space="preserve">Certifications</w:t>
-      </w:r>
-    </w:p>
-    <w:p>
-      <w:pPr>
-        <w:pStyle w:val="FirstParagraph"/>
-      </w:pPr>
-      <w:r>
-        <w:t xml:space="preserve">AWS—7 Certifications including:</w:t>
-      </w:r>
-    </w:p>
-    <w:p>
-      <w:pPr>
-        <w:pStyle w:val="BodyText"/>
-      </w:pPr>
-      <w:r>
-        <w:t xml:space="preserve">Machine Learning–Specialty</w:t>
-      </w:r>
-    </w:p>
-    <w:p>
-      <w:pPr>
-        <w:pStyle w:val="BodyText"/>
-      </w:pPr>
-      <w:r>
-        <w:t xml:space="preserve">Solutions Architect–Professional</w:t>
-      </w:r>
-    </w:p>
-    <w:p>
-      <w:pPr>
-        <w:pStyle w:val="BodyText"/>
-      </w:pPr>
-      <w:r>
-        <w:t xml:space="preserve">Data Analytics–Specialty</w:t>
-      </w:r>
-    </w:p>
-    <w:p>
-      <w:pPr>
-        <w:pStyle w:val="BodyText"/>
-      </w:pPr>
-      <w:r>
-        <w:t xml:space="preserve">Data Engineer Associate</w:t>
-      </w:r>
-    </w:p>
-    <w:p>
-      <w:pPr>
-        <w:pStyle w:val="BodyText"/>
-      </w:pPr>
-      <w:r>
-        <w:t xml:space="preserve">Microsoft Azure:</w:t>
-      </w:r>
-    </w:p>
-    <w:p>
-      <w:pPr>
-        <w:pStyle w:val="BodyText"/>
-      </w:pPr>
-      <w:r>
-        <w:t xml:space="preserve">DevOps Engineer Expert</w:t>
-      </w:r>
-    </w:p>
-    <w:p>
-      <w:pPr>
-        <w:pStyle w:val="BodyText"/>
-      </w:pPr>
-      <w:r>
-        <w:t xml:space="preserve">AI Fundamentals</w:t>
-      </w:r>
-    </w:p>
-    <w:p>
-      <w:pPr>
-        <w:pStyle w:val="BodyText"/>
-      </w:pPr>
-      <w:r>
-        <w:t xml:space="preserve">Security, Compliance &amp; Identity Fundamentals</w:t>
-      </w:r>
-    </w:p>
-    <w:p>
-      <w:pPr>
-        <w:pStyle w:val="BodyText"/>
-      </w:pPr>
-      <w:r>
-        <w:rPr>
-          <w:b/>
-          <w:bCs/>
-        </w:rPr>
-        <w:t xml:space="preserve">CISSP</w:t>
-      </w:r>
-      <w:r>
-        <w:t xml:space="preserve"> </w:t>
-      </w:r>
-      <w:r>
-        <w:t xml:space="preserve">&amp;</w:t>
-      </w:r>
-      <w:r>
-        <w:t xml:space="preserve"> </w:t>
-      </w:r>
-      <w:r>
-        <w:rPr>
-          <w:b/>
-          <w:bCs/>
-        </w:rPr>
-        <w:t xml:space="preserve">CCSP</w:t>
-      </w:r>
-      <w:r>
-        <w:t xml:space="preserve">—(ISC)²</w:t>
-      </w:r>
-      <w:r>
-        <w:t xml:space="preserve"> </w:t>
-      </w:r>
-      <w:r>
-        <w:t xml:space="preserve">|</w:t>
-      </w:r>
-      <w:r>
-        <w:t xml:space="preserve"> </w:t>
-      </w:r>
-      <w:r>
-        <w:rPr>
-          <w:b/>
-          <w:bCs/>
-        </w:rPr>
-        <w:t xml:space="preserve">PMP</w:t>
-      </w:r>
-      <w:r>
-        <w:t xml:space="preserve"> </w:t>
-      </w:r>
-      <w:r>
-        <w:t xml:space="preserve">&amp;</w:t>
-      </w:r>
-      <w:r>
-        <w:t xml:space="preserve"> </w:t>
-      </w:r>
-      <w:r>
-        <w:rPr>
-          <w:b/>
-          <w:bCs/>
-        </w:rPr>
-        <w:t xml:space="preserve">PgMP</w:t>
-      </w:r>
-      <w:r>
-        <w:t xml:space="preserve">—PMI</w:t>
-      </w:r>
-      <w:r>
-        <w:t xml:space="preserve"> </w:t>
-      </w:r>
-      <w:r>
-        <w:t xml:space="preserve">|</w:t>
-      </w:r>
-      <w:r>
-        <w:t xml:space="preserve"> </w:t>
-      </w:r>
-      <w:r>
-        <w:rPr>
-          <w:b/>
-          <w:bCs/>
-        </w:rPr>
-        <w:t xml:space="preserve">IEEE Senior Member</w:t>
-      </w:r>
-      <w:r>
-        <w:t xml:space="preserve"> </w:t>
-      </w:r>
-      <w:r>
-        <w:t xml:space="preserve">&amp;</w:t>
-      </w:r>
-      <w:r>
-        <w:t xml:space="preserve"> </w:t>
-      </w:r>
-      <w:r>
-        <w:rPr>
-          <w:b/>
-          <w:bCs/>
-        </w:rPr>
-        <w:t xml:space="preserve">Wireless Communications Professional (WCP)</w:t>
-      </w:r>
-    </w:p>
-    <w:bookmarkEnd w:id="19"/>
-    <w:bookmarkStart w:id="20" w:name="education"/>
-    <w:p>
-      <w:pPr>
-        <w:pStyle w:val="Heading2"/>
-      </w:pPr>
-      <w:r>
-        <w:t xml:space="preserve">Education</w:t>
-      </w:r>
-    </w:p>
-    <w:p>
-      <w:pPr>
-        <w:pStyle w:val="FirstParagraph"/>
-      </w:pPr>
-      <w:r>
-        <w:t xml:space="preserve">Master of Computer Science</w:t>
-      </w:r>
-      <w:r>
-        <w:t xml:space="preserve">, University of Illinois Urbana-Champaign (2017)</w:t>
-      </w:r>
-    </w:p>
-    <w:p>
-      <w:pPr>
-        <w:pStyle w:val="BodyText"/>
-      </w:pPr>
-      <w:r>
-        <w:t xml:space="preserve">Master of Science, Electrical Engineering</w:t>
-      </w:r>
-      <w:r>
-        <w:t xml:space="preserve">, University of Maryland, College Park</w:t>
-      </w:r>
-    </w:p>
-    <w:p>
-      <w:pPr>
-        <w:pStyle w:val="BodyText"/>
-      </w:pPr>
-      <w:r>
-        <w:t xml:space="preserve">Bachelor of Science, Electrical Engineering</w:t>
-      </w:r>
-      <w:r>
-        <w:t xml:space="preserve">, University of Maryland, College Park</w:t>
-      </w:r>
-    </w:p>
-    <w:bookmarkEnd w:id="20"/>
-    <w:bookmarkStart w:id="21" w:name="professional-memberships"/>
-    <w:p>
-      <w:pPr>
-        <w:pStyle w:val="Heading2"/>
-      </w:pPr>
-      <w:r>
-        <w:t xml:space="preserve">Professional Memberships</w:t>
-      </w:r>
-    </w:p>
-    <w:p>
-      <w:pPr>
-        <w:pStyle w:val="FirstParagraph"/>
-      </w:pPr>
-      <w:r>
-        <w:t xml:space="preserve">IEEE Senior Member •</w:t>
-      </w:r>
-      <w:r>
-        <w:t xml:space="preserve"> </w:t>
-      </w:r>
-      <w:r>
-        <w:t xml:space="preserve">International Association of Privacy Professionals (IAPP) •</w:t>
-      </w:r>
-      <w:r>
-        <w:t xml:space="preserve"> </w:t>
-      </w:r>
-      <w:r>
-        <w:t xml:space="preserve">(ISC)² •</w:t>
-      </w:r>
-      <w:r>
-        <w:t xml:space="preserve"> </w:t>
-      </w:r>
-      <w:r>
-        <w:t xml:space="preserve">Project Management Institute (PMI) •</w:t>
-      </w:r>
-      <w:r>
-        <w:t xml:space="preserve"> </w:t>
-      </w:r>
-      <w:r>
-        <w:t xml:space="preserve">Open Worldwide Application Security Project (OWASP)</w:t>
-      </w:r>
-    </w:p>
-    <w:bookmarkEnd w:id="21"/>
-    <w:bookmarkStart w:id="22" w:name="patents"/>
-    <w:p>
-      <w:pPr>
-        <w:pStyle w:val="Heading2"/>
-      </w:pPr>
-      <w:r>
-        <w:t xml:space="preserve">Patents</w:t>
-      </w:r>
-    </w:p>
-    <w:p>
-      <w:pPr>
-        <w:pStyle w:val="FirstParagraph"/>
-      </w:pPr>
-      <w:r>
-        <w:rPr>
-          <w:b/>
-          <w:bCs/>
-        </w:rPr>
-        <w:t xml:space="preserve">Two U.S. Patents Filed 2026—AI Agent Safety.</w:t>
-      </w:r>
-      <w:r>
-        <w:t xml:space="preserve"> </w:t>
-      </w:r>
-      <w:r>
-        <w:t xml:space="preserve">Independent inventor and applicant; active applied research program in autonomous-agent permission and capability architecture.</w:t>
-      </w:r>
-      <w:r>
-        <w:br/>
-      </w:r>
-      <w:r>
-        <w:br/>
-      </w:r>
-      <w:r>
-        <w:rPr>
-          <w:b/>
-          <w:bCs/>
-        </w:rPr>
         <w:t xml:space="preserve">22 issued U.S. patents</w:t>
       </w:r>
       <w:r>
         <w:t xml:space="preserve"> </w:t>
       </w:r>
       <w:r>
-        <w:t xml:space="preserve">spanning AI, cloud computing, cybersecurity, IoT, and wireless communications, plus 9 pending applications. Domains include document analysis using ML and neural networks, customer service automation, sentiment detection, autonomous vehicle systems, edge network management, and biometric systems.</w:t>
-      </w:r>
-    </w:p>
-    <w:bookmarkEnd w:id="22"/>
+        <w:t xml:space="preserve">spanning AI, cloud computing, cybersecurity, IoT, and wireless communications, plus 9 pending applications and the two 2026 agent-safety filings. Domains include document analysis using ML and neural networks, customer service automation, sentiment detection, autonomous vehicle systems, edge network management, and biometric systems.</w:t>
+      </w:r>
+    </w:p>
+    <w:bookmarkEnd w:id="23"/>
     <w:sectPr>
       <w:footnotePr>
         <w:numRestart w:val="eachSect"/>

</xml_diff>